<commit_message>
add it3 SPPP, MeetingMinutes, ProgressReport
</commit_message>
<xml_diff>
--- a/doc/CS673_MeetingMinutes_team2.docx
+++ b/doc/CS673_MeetingMinutes_team2.docx
@@ -235,32 +235,6 @@
     </w:p>
     <w:p>
       <w:pPr>
-        <w:rPr>
-          <w:sz w:val="24"/>
-          <w:szCs w:val="24"/>
-        </w:rPr>
-      </w:pPr>
-      <w:r>
-        <w:rPr>
-          <w:b w:val="1"/>
-          <w:bCs w:val="1"/>
-          <w:sz w:val="24"/>
-          <w:szCs w:val="24"/>
-          <w:rtl w:val="0"/>
-        </w:rPr>
-        <w:t xml:space="preserve">NOTE TO GRADERS: </w:t>
-      </w:r>
-      <w:r>
-        <w:rPr>
-          <w:sz w:val="24"/>
-          <w:szCs w:val="24"/>
-          <w:rtl w:val="0"/>
-        </w:rPr>
-        <w:t xml:space="preserve">Our team has had difficulty planning synchronous meetings due to some of our team working day jobs taking up full weekdays (Miles) and weekends (Von), and others taking courses covering weeknight evenings (Nurzat and Duc). As such, we have been communicating frequently via Discord and managing team plans via shared markdown files committed to our repo and reviewed across the team via PR before being finalized. We have found that this is an effective way for our team to stay organized and on schedule. We request your understanding in the grading of our meetings.</w:t>
-      </w:r>
-    </w:p>
-    <w:p>
-      <w:pPr>
         <w:keepNext w:val="0"/>
         <w:keepLines w:val="0"/>
         <w:pageBreakBefore w:val="0"/>
@@ -337,6 +311,953 @@
           <w:u w:val="single"/>
           <w:rtl w:val="0"/>
         </w:rPr>
+        <w:t xml:space="preserve">Meeting 6</w:t>
+      </w:r>
+    </w:p>
+    <w:p>
+      <w:pPr>
+        <w:jc w:val="center"/>
+        <w:rPr>
+          <w:b w:val="1"/>
+          <w:bCs w:val="1"/>
+          <w:sz w:val="24"/>
+          <w:szCs w:val="24"/>
+          <w:u w:val="single"/>
+        </w:rPr>
+      </w:pPr>
+      <w:r>
+        <w:rPr>
+          <w:rtl w:val="0"/>
+        </w:rPr>
+      </w:r>
+    </w:p>
+    <w:p>
+      <w:pPr>
+        <w:rPr>
+          <w:sz w:val="24"/>
+          <w:szCs w:val="24"/>
+        </w:rPr>
+      </w:pPr>
+      <w:r>
+        <w:rPr>
+          <w:b w:val="1"/>
+          <w:bCs w:val="1"/>
+          <w:sz w:val="24"/>
+          <w:szCs w:val="24"/>
+          <w:rtl w:val="0"/>
+        </w:rPr>
+        <w:t xml:space="preserve">Date and Time:</w:t>
+      </w:r>
+      <w:r>
+        <w:rPr>
+          <w:sz w:val="24"/>
+          <w:szCs w:val="24"/>
+          <w:rtl w:val="0"/>
+        </w:rPr>
+        <w:t xml:space="preserve">  10/11/26, 3:30pm</w:t>
+      </w:r>
+    </w:p>
+    <w:p>
+      <w:pPr>
+        <w:rPr>
+          <w:sz w:val="24"/>
+          <w:szCs w:val="24"/>
+        </w:rPr>
+      </w:pPr>
+      <w:r>
+        <w:rPr>
+          <w:b w:val="1"/>
+          <w:bCs w:val="1"/>
+          <w:sz w:val="24"/>
+          <w:szCs w:val="24"/>
+          <w:rtl w:val="0"/>
+        </w:rPr>
+        <w:t xml:space="preserve">Place</w:t>
+      </w:r>
+      <w:r>
+        <w:rPr>
+          <w:sz w:val="24"/>
+          <w:szCs w:val="24"/>
+          <w:rtl w:val="0"/>
+        </w:rPr>
+        <w:t xml:space="preserve">: Zoom</w:t>
+      </w:r>
+    </w:p>
+    <w:p>
+      <w:pPr>
+        <w:rPr>
+          <w:sz w:val="24"/>
+          <w:szCs w:val="24"/>
+        </w:rPr>
+      </w:pPr>
+      <w:r>
+        <w:rPr>
+          <w:b w:val="1"/>
+          <w:bCs w:val="1"/>
+          <w:sz w:val="24"/>
+          <w:szCs w:val="24"/>
+          <w:rtl w:val="0"/>
+        </w:rPr>
+        <w:t xml:space="preserve">Participants:</w:t>
+      </w:r>
+      <w:r>
+        <w:rPr>
+          <w:sz w:val="24"/>
+          <w:szCs w:val="24"/>
+          <w:rtl w:val="0"/>
+        </w:rPr>
+        <w:t xml:space="preserve"> Miles, Nurzat, Von, Duc</w:t>
+      </w:r>
+    </w:p>
+    <w:p>
+      <w:pPr>
+        <w:rPr>
+          <w:sz w:val="24"/>
+          <w:szCs w:val="24"/>
+        </w:rPr>
+      </w:pPr>
+      <w:r>
+        <w:rPr>
+          <w:b w:val="1"/>
+          <w:bCs w:val="1"/>
+          <w:sz w:val="24"/>
+          <w:szCs w:val="24"/>
+          <w:rtl w:val="0"/>
+        </w:rPr>
+        <w:t xml:space="preserve">Minutes taker:  </w:t>
+      </w:r>
+      <w:r>
+        <w:rPr>
+          <w:sz w:val="24"/>
+          <w:szCs w:val="24"/>
+          <w:rtl w:val="0"/>
+        </w:rPr>
+        <w:t xml:space="preserve">Nurzat</w:t>
+      </w:r>
+    </w:p>
+    <w:p>
+      <w:pPr>
+        <w:rPr>
+          <w:sz w:val="24"/>
+          <w:szCs w:val="24"/>
+        </w:rPr>
+      </w:pPr>
+      <w:r>
+        <w:rPr>
+          <w:b w:val="1"/>
+          <w:bCs w:val="1"/>
+          <w:sz w:val="24"/>
+          <w:szCs w:val="24"/>
+          <w:rtl w:val="0"/>
+        </w:rPr>
+        <w:t xml:space="preserve">Timekeeper: </w:t>
+      </w:r>
+      <w:r>
+        <w:rPr>
+          <w:sz w:val="24"/>
+          <w:szCs w:val="24"/>
+          <w:rtl w:val="0"/>
+        </w:rPr>
+        <w:t xml:space="preserve">Nurzat</w:t>
+      </w:r>
+    </w:p>
+    <w:p>
+      <w:pPr>
+        <w:rPr>
+          <w:sz w:val="24"/>
+          <w:szCs w:val="24"/>
+        </w:rPr>
+      </w:pPr>
+      <w:r>
+        <w:rPr>
+          <w:b w:val="1"/>
+          <w:bCs w:val="1"/>
+          <w:sz w:val="24"/>
+          <w:szCs w:val="24"/>
+          <w:rtl w:val="0"/>
+        </w:rPr>
+        <w:t xml:space="preserve">Purpose: </w:t>
+      </w:r>
+      <w:r>
+        <w:rPr>
+          <w:sz w:val="24"/>
+          <w:szCs w:val="24"/>
+          <w:rtl w:val="0"/>
+        </w:rPr>
+        <w:t xml:space="preserve">Final Iteration Wrap-up Planning</w:t>
+      </w:r>
+    </w:p>
+    <w:p>
+      <w:pPr>
+        <w:rPr>
+          <w:sz w:val="24"/>
+          <w:szCs w:val="24"/>
+        </w:rPr>
+      </w:pPr>
+      <w:r>
+        <w:rPr>
+          <w:rtl w:val="0"/>
+        </w:rPr>
+      </w:r>
+    </w:p>
+    <w:p>
+      <w:pPr>
+        <w:rPr>
+          <w:sz w:val="24"/>
+          <w:szCs w:val="24"/>
+        </w:rPr>
+      </w:pPr>
+      <w:r>
+        <w:rPr>
+          <w:b w:val="1"/>
+          <w:bCs w:val="1"/>
+          <w:sz w:val="24"/>
+          <w:szCs w:val="24"/>
+          <w:rtl w:val="0"/>
+        </w:rPr>
+        <w:t xml:space="preserve">Agenda: </w:t>
+      </w:r>
+      <w:r>
+        <w:rPr>
+          <w:rtl w:val="0"/>
+        </w:rPr>
+      </w:r>
+    </w:p>
+    <w:p>
+      <w:pPr>
+        <w:numPr>
+          <w:ilvl w:val="0"/>
+          <w:numId w:val="10"/>
+        </w:numPr>
+        <w:spacing w:line="276" w:lineRule="auto"/>
+        <w:ind w:left="720" w:hanging="360"/>
+        <w:rPr>
+          <w:sz w:val="24"/>
+          <w:szCs w:val="24"/>
+          <w:u w:val="none"/>
+        </w:rPr>
+      </w:pPr>
+      <w:r>
+        <w:rPr>
+          <w:sz w:val="24"/>
+          <w:szCs w:val="24"/>
+          <w:rtl w:val="0"/>
+        </w:rPr>
+        <w:t xml:space="preserve">Review Iteration 3 implementation progress and remaining integration work.</w:t>
+      </w:r>
+    </w:p>
+    <w:p>
+      <w:pPr>
+        <w:numPr>
+          <w:ilvl w:val="0"/>
+          <w:numId w:val="10"/>
+        </w:numPr>
+        <w:spacing w:line="276" w:lineRule="auto"/>
+        <w:ind w:left="720" w:hanging="360"/>
+        <w:rPr>
+          <w:sz w:val="24"/>
+          <w:szCs w:val="24"/>
+          <w:u w:val="none"/>
+        </w:rPr>
+      </w:pPr>
+      <w:r>
+        <w:rPr>
+          <w:sz w:val="24"/>
+          <w:szCs w:val="24"/>
+          <w:rtl w:val="0"/>
+        </w:rPr>
+        <w:t xml:space="preserve">Coordinate deployment, acceptance testing, and documentation updates.</w:t>
+      </w:r>
+    </w:p>
+    <w:p>
+      <w:pPr>
+        <w:numPr>
+          <w:ilvl w:val="0"/>
+          <w:numId w:val="10"/>
+        </w:numPr>
+        <w:spacing w:line="276" w:lineRule="auto"/>
+        <w:ind w:left="720" w:hanging="360"/>
+        <w:rPr>
+          <w:sz w:val="24"/>
+          <w:szCs w:val="24"/>
+          <w:u w:val="none"/>
+        </w:rPr>
+      </w:pPr>
+      <w:r>
+        <w:rPr>
+          <w:sz w:val="24"/>
+          <w:szCs w:val="24"/>
+          <w:rtl w:val="0"/>
+        </w:rPr>
+        <w:t xml:space="preserve">Assign presentation, demo, and code walkthrough responsibilities.</w:t>
+      </w:r>
+    </w:p>
+    <w:p>
+      <w:pPr>
+        <w:numPr>
+          <w:ilvl w:val="0"/>
+          <w:numId w:val="10"/>
+        </w:numPr>
+        <w:spacing w:line="276" w:lineRule="auto"/>
+        <w:ind w:left="720" w:hanging="360"/>
+        <w:rPr>
+          <w:sz w:val="24"/>
+          <w:szCs w:val="24"/>
+          <w:u w:val="none"/>
+        </w:rPr>
+      </w:pPr>
+      <w:r>
+        <w:rPr>
+          <w:sz w:val="24"/>
+          <w:szCs w:val="24"/>
+          <w:rtl w:val="0"/>
+        </w:rPr>
+        <w:t xml:space="preserve">Plan final deliverable review and submission.</w:t>
+      </w:r>
+    </w:p>
+    <w:p>
+      <w:pPr>
+        <w:rPr>
+          <w:b w:val="1"/>
+          <w:bCs w:val="1"/>
+          <w:sz w:val="24"/>
+          <w:szCs w:val="24"/>
+        </w:rPr>
+      </w:pPr>
+      <w:r>
+        <w:rPr>
+          <w:rtl w:val="0"/>
+        </w:rPr>
+      </w:r>
+    </w:p>
+    <w:p>
+      <w:pPr>
+        <w:rPr>
+          <w:sz w:val="24"/>
+          <w:szCs w:val="24"/>
+        </w:rPr>
+      </w:pPr>
+      <w:r>
+        <w:rPr>
+          <w:b w:val="1"/>
+          <w:bCs w:val="1"/>
+          <w:sz w:val="24"/>
+          <w:szCs w:val="24"/>
+          <w:rtl w:val="0"/>
+        </w:rPr>
+        <w:t xml:space="preserve">Discussions:</w:t>
+      </w:r>
+      <w:r>
+        <w:rPr>
+          <w:rtl w:val="0"/>
+        </w:rPr>
+      </w:r>
+    </w:p>
+    <w:p>
+      <w:pPr>
+        <w:numPr>
+          <w:ilvl w:val="0"/>
+          <w:numId w:val="7"/>
+        </w:numPr>
+        <w:spacing w:after="0" w:afterAutospacing="0" w:before="240" w:lineRule="auto"/>
+        <w:ind w:left="720" w:hanging="360"/>
+        <w:rPr>
+          <w:sz w:val="24"/>
+          <w:szCs w:val="24"/>
+          <w:u w:val="none"/>
+        </w:rPr>
+      </w:pPr>
+      <w:r>
+        <w:rPr>
+          <w:sz w:val="24"/>
+          <w:szCs w:val="24"/>
+          <w:rtl w:val="0"/>
+        </w:rPr>
+        <w:t xml:space="preserve">The team reviewed the Iteration 3 features, including AI card generation, accepting and rejecting suggestions, AI-generated card badges, and typed-answer study mode. Remaining work included completing reviews, checking integration, and verifying the application before the final release.</w:t>
+      </w:r>
+    </w:p>
+    <w:p>
+      <w:pPr>
+        <w:numPr>
+          <w:ilvl w:val="0"/>
+          <w:numId w:val="7"/>
+        </w:numPr>
+        <w:spacing w:after="0" w:afterAutospacing="0" w:before="0" w:beforeAutospacing="0" w:lineRule="auto"/>
+        <w:ind w:left="720" w:hanging="360"/>
+        <w:rPr>
+          <w:sz w:val="24"/>
+          <w:szCs w:val="24"/>
+          <w:u w:val="none"/>
+        </w:rPr>
+      </w:pPr>
+      <w:r>
+        <w:rPr>
+          <w:sz w:val="24"/>
+          <w:szCs w:val="24"/>
+          <w:rtl w:val="0"/>
+        </w:rPr>
+        <w:t xml:space="preserve">The team discussed the typed-mode implementation across F4, F5, and F6. The typed study flow depends on the answer checker and typed-mode building blocks, so those components need to be integrated first.</w:t>
+      </w:r>
+    </w:p>
+    <w:p>
+      <w:pPr>
+        <w:numPr>
+          <w:ilvl w:val="0"/>
+          <w:numId w:val="7"/>
+        </w:numPr>
+        <w:spacing w:after="0" w:afterAutospacing="0" w:before="0" w:beforeAutospacing="0" w:lineRule="auto"/>
+        <w:ind w:left="720" w:hanging="360"/>
+        <w:rPr>
+          <w:sz w:val="24"/>
+          <w:szCs w:val="24"/>
+          <w:u w:val="none"/>
+        </w:rPr>
+      </w:pPr>
+      <w:r>
+        <w:rPr>
+          <w:sz w:val="24"/>
+          <w:szCs w:val="24"/>
+          <w:rtl w:val="0"/>
+        </w:rPr>
+        <w:t xml:space="preserve">Deployment and acceptance testing were discussed as prerequisites for final reporting. The presentation and testing documentation need to reflect actual results, including generation times and deployment checks. Unconfirmed results should remain pending until verification is complete.</w:t>
+      </w:r>
+    </w:p>
+    <w:p>
+      <w:pPr>
+        <w:numPr>
+          <w:ilvl w:val="0"/>
+          <w:numId w:val="7"/>
+        </w:numPr>
+        <w:spacing w:after="0" w:afterAutospacing="0" w:before="0" w:beforeAutospacing="0" w:lineRule="auto"/>
+        <w:ind w:left="720" w:hanging="360"/>
+        <w:rPr>
+          <w:sz w:val="24"/>
+          <w:szCs w:val="24"/>
+          <w:u w:val="none"/>
+        </w:rPr>
+      </w:pPr>
+      <w:r>
+        <w:rPr>
+          <w:sz w:val="24"/>
+          <w:szCs w:val="24"/>
+          <w:rtl w:val="0"/>
+        </w:rPr>
+        <w:t xml:space="preserve">The team reviewed the documentation responsibilities for the final iteration, including the SPPP, SDD, STD, risk register, meeting minutes, progress reports, and AI-usage logs.</w:t>
+      </w:r>
+    </w:p>
+    <w:p>
+      <w:pPr>
+        <w:numPr>
+          <w:ilvl w:val="0"/>
+          <w:numId w:val="7"/>
+        </w:numPr>
+        <w:spacing w:after="240" w:before="0" w:beforeAutospacing="0" w:lineRule="auto"/>
+        <w:ind w:left="720" w:hanging="360"/>
+        <w:rPr>
+          <w:sz w:val="24"/>
+          <w:szCs w:val="24"/>
+          <w:u w:val="none"/>
+        </w:rPr>
+      </w:pPr>
+      <w:r>
+        <w:rPr>
+          <w:sz w:val="24"/>
+          <w:szCs w:val="24"/>
+          <w:rtl w:val="0"/>
+        </w:rPr>
+        <w:t xml:space="preserve">The team also discussed preparing separate presentations, demonstration, and code walkthrough videos. Each member would record their assigned presentation and walkthrough sections, with consistent recording settings to support combining the recordings.</w:t>
+      </w:r>
+    </w:p>
+    <w:p>
+      <w:pPr>
+        <w:rPr>
+          <w:b w:val="1"/>
+          <w:bCs w:val="1"/>
+          <w:sz w:val="24"/>
+          <w:szCs w:val="24"/>
+        </w:rPr>
+      </w:pPr>
+      <w:r>
+        <w:rPr>
+          <w:b w:val="1"/>
+          <w:bCs w:val="1"/>
+          <w:sz w:val="24"/>
+          <w:szCs w:val="24"/>
+          <w:rtl w:val="0"/>
+        </w:rPr>
+        <w:t xml:space="preserve">Key Decisions:</w:t>
+      </w:r>
+    </w:p>
+    <w:p>
+      <w:pPr>
+        <w:numPr>
+          <w:ilvl w:val="0"/>
+          <w:numId w:val="17"/>
+        </w:numPr>
+        <w:ind w:left="720" w:hanging="360"/>
+        <w:rPr>
+          <w:sz w:val="24"/>
+          <w:szCs w:val="24"/>
+          <w:u w:val="none"/>
+        </w:rPr>
+      </w:pPr>
+      <w:r>
+        <w:rPr>
+          <w:sz w:val="24"/>
+          <w:szCs w:val="24"/>
+          <w:rtl w:val="0"/>
+        </w:rPr>
+        <w:t xml:space="preserve">Retain AI card generation and typed-answer study mode as the main Iteration 3 features. Multiple-choice mode remains outside the final iteration’s scope.</w:t>
+      </w:r>
+    </w:p>
+    <w:p>
+      <w:pPr>
+        <w:numPr>
+          <w:ilvl w:val="0"/>
+          <w:numId w:val="17"/>
+        </w:numPr>
+        <w:ind w:left="720" w:hanging="360"/>
+        <w:rPr>
+          <w:sz w:val="24"/>
+          <w:szCs w:val="24"/>
+          <w:u w:val="none"/>
+        </w:rPr>
+      </w:pPr>
+      <w:r>
+        <w:rPr>
+          <w:sz w:val="24"/>
+          <w:szCs w:val="24"/>
+          <w:rtl w:val="0"/>
+        </w:rPr>
+        <w:t xml:space="preserve">Review and integrate the typed-answer checker and building blocks before the dependent typed study flow.</w:t>
+      </w:r>
+    </w:p>
+    <w:p>
+      <w:pPr>
+        <w:numPr>
+          <w:ilvl w:val="0"/>
+          <w:numId w:val="17"/>
+        </w:numPr>
+        <w:ind w:left="720" w:hanging="360"/>
+        <w:rPr>
+          <w:sz w:val="24"/>
+          <w:szCs w:val="24"/>
+          <w:u w:val="none"/>
+        </w:rPr>
+      </w:pPr>
+      <w:r>
+        <w:rPr>
+          <w:sz w:val="24"/>
+          <w:szCs w:val="24"/>
+          <w:rtl w:val="0"/>
+        </w:rPr>
+        <w:t xml:space="preserve">Complete acceptance testing and confirm deployment results before finalizing claims in the presentation and documentation.</w:t>
+      </w:r>
+    </w:p>
+    <w:p>
+      <w:pPr>
+        <w:numPr>
+          <w:ilvl w:val="0"/>
+          <w:numId w:val="17"/>
+        </w:numPr>
+        <w:ind w:left="720" w:hanging="360"/>
+        <w:rPr>
+          <w:sz w:val="24"/>
+          <w:szCs w:val="24"/>
+          <w:u w:val="none"/>
+        </w:rPr>
+      </w:pPr>
+      <w:r>
+        <w:rPr>
+          <w:sz w:val="24"/>
+          <w:szCs w:val="24"/>
+          <w:rtl w:val="0"/>
+        </w:rPr>
+        <w:t xml:space="preserve">Use the Iteration 2 presentation design as the basis for the Iteration 3 slides.</w:t>
+      </w:r>
+    </w:p>
+    <w:p>
+      <w:pPr>
+        <w:numPr>
+          <w:ilvl w:val="0"/>
+          <w:numId w:val="17"/>
+        </w:numPr>
+        <w:ind w:left="720" w:hanging="360"/>
+        <w:rPr>
+          <w:sz w:val="24"/>
+          <w:szCs w:val="24"/>
+          <w:u w:val="none"/>
+        </w:rPr>
+      </w:pPr>
+      <w:r>
+        <w:rPr>
+          <w:sz w:val="24"/>
+          <w:szCs w:val="24"/>
+          <w:rtl w:val="0"/>
+        </w:rPr>
+        <w:t xml:space="preserve">Record the presentation in the order Nurzat, Duc, Von, and Miles. Nurzat will assemble the presentation video.</w:t>
+      </w:r>
+    </w:p>
+    <w:p>
+      <w:pPr>
+        <w:numPr>
+          <w:ilvl w:val="0"/>
+          <w:numId w:val="17"/>
+        </w:numPr>
+        <w:ind w:left="720" w:hanging="360"/>
+        <w:rPr>
+          <w:sz w:val="24"/>
+          <w:szCs w:val="24"/>
+          <w:u w:val="none"/>
+        </w:rPr>
+      </w:pPr>
+      <w:r>
+        <w:rPr>
+          <w:sz w:val="24"/>
+          <w:szCs w:val="24"/>
+          <w:rtl w:val="0"/>
+        </w:rPr>
+        <w:t xml:space="preserve">Record the code walkthrough in the order Miles, Duc, Von, and Nurzat. Nurzat will assemble the walkthrough video.</w:t>
+      </w:r>
+    </w:p>
+    <w:p>
+      <w:pPr>
+        <w:numPr>
+          <w:ilvl w:val="0"/>
+          <w:numId w:val="17"/>
+        </w:numPr>
+        <w:ind w:left="720" w:hanging="360"/>
+        <w:rPr>
+          <w:sz w:val="24"/>
+          <w:szCs w:val="24"/>
+          <w:u w:val="none"/>
+        </w:rPr>
+      </w:pPr>
+      <w:r>
+        <w:rPr>
+          <w:sz w:val="24"/>
+          <w:szCs w:val="24"/>
+          <w:rtl w:val="0"/>
+        </w:rPr>
+        <w:t xml:space="preserve">Keep the application demonstration as a separate video, coordinated by Miles.</w:t>
+      </w:r>
+    </w:p>
+    <w:p>
+      <w:pPr>
+        <w:numPr>
+          <w:ilvl w:val="0"/>
+          <w:numId w:val="17"/>
+        </w:numPr>
+        <w:ind w:left="720" w:hanging="360"/>
+        <w:rPr>
+          <w:sz w:val="24"/>
+          <w:szCs w:val="24"/>
+          <w:u w:val="none"/>
+        </w:rPr>
+      </w:pPr>
+      <w:r>
+        <w:rPr>
+          <w:sz w:val="24"/>
+          <w:szCs w:val="24"/>
+          <w:rtl w:val="0"/>
+        </w:rPr>
+        <w:t xml:space="preserve">Complete a final consistency check across documentation, recordings, and submission links before release.</w:t>
+      </w:r>
+    </w:p>
+    <w:p>
+      <w:pPr>
+        <w:rPr>
+          <w:b w:val="1"/>
+          <w:bCs w:val="1"/>
+          <w:sz w:val="24"/>
+          <w:szCs w:val="24"/>
+        </w:rPr>
+      </w:pPr>
+      <w:r>
+        <w:rPr>
+          <w:rtl w:val="0"/>
+        </w:rPr>
+      </w:r>
+    </w:p>
+    <w:p>
+      <w:pPr>
+        <w:rPr>
+          <w:b w:val="1"/>
+          <w:bCs w:val="1"/>
+          <w:sz w:val="24"/>
+          <w:szCs w:val="24"/>
+        </w:rPr>
+      </w:pPr>
+      <w:r>
+        <w:rPr>
+          <w:b w:val="1"/>
+          <w:bCs w:val="1"/>
+          <w:sz w:val="24"/>
+          <w:szCs w:val="24"/>
+          <w:rtl w:val="0"/>
+        </w:rPr>
+        <w:t xml:space="preserve">Action Items:</w:t>
+      </w:r>
+    </w:p>
+    <w:p>
+      <w:pPr>
+        <w:numPr>
+          <w:ilvl w:val="0"/>
+          <w:numId w:val="14"/>
+        </w:numPr>
+        <w:ind w:left="720" w:hanging="360"/>
+        <w:rPr>
+          <w:sz w:val="24"/>
+          <w:szCs w:val="24"/>
+          <w:u w:val="none"/>
+        </w:rPr>
+      </w:pPr>
+      <w:r>
+        <w:rPr>
+          <w:sz w:val="24"/>
+          <w:szCs w:val="24"/>
+          <w:rtl w:val="0"/>
+        </w:rPr>
+        <w:t xml:space="preserve">All: finish assigned implementation work, address review feedback, and complete acceptance testing. Due before the Iteration 3 submission.</w:t>
+      </w:r>
+    </w:p>
+    <w:p>
+      <w:pPr>
+        <w:numPr>
+          <w:ilvl w:val="0"/>
+          <w:numId w:val="14"/>
+        </w:numPr>
+        <w:ind w:left="720" w:hanging="360"/>
+        <w:rPr>
+          <w:sz w:val="24"/>
+          <w:szCs w:val="24"/>
+          <w:u w:val="none"/>
+        </w:rPr>
+      </w:pPr>
+      <w:r>
+        <w:rPr>
+          <w:sz w:val="24"/>
+          <w:szCs w:val="24"/>
+          <w:rtl w:val="0"/>
+        </w:rPr>
+        <w:t xml:space="preserve">Duc: update the SPPP and CI/CD documentation, complete deployment work, and assemble the code walkthrough video. Due before the Iteration 3 submission.</w:t>
+      </w:r>
+    </w:p>
+    <w:p>
+      <w:pPr>
+        <w:numPr>
+          <w:ilvl w:val="0"/>
+          <w:numId w:val="14"/>
+        </w:numPr>
+        <w:ind w:left="720" w:hanging="360"/>
+        <w:rPr>
+          <w:sz w:val="24"/>
+          <w:szCs w:val="24"/>
+          <w:u w:val="none"/>
+        </w:rPr>
+      </w:pPr>
+      <w:r>
+        <w:rPr>
+          <w:sz w:val="24"/>
+          <w:szCs w:val="24"/>
+          <w:rtl w:val="0"/>
+        </w:rPr>
+        <w:t xml:space="preserve">Miles: update the SDD and project overview documentation, record the demo, review PRs, and coordinate the final release. Due before the Iteration 3 submission.</w:t>
+      </w:r>
+    </w:p>
+    <w:p>
+      <w:pPr>
+        <w:numPr>
+          <w:ilvl w:val="0"/>
+          <w:numId w:val="14"/>
+        </w:numPr>
+        <w:ind w:left="720" w:hanging="360"/>
+        <w:rPr>
+          <w:sz w:val="24"/>
+          <w:szCs w:val="24"/>
+          <w:u w:val="none"/>
+        </w:rPr>
+      </w:pPr>
+      <w:r>
+        <w:rPr>
+          <w:sz w:val="24"/>
+          <w:szCs w:val="24"/>
+          <w:rtl w:val="0"/>
+        </w:rPr>
+        <w:t xml:space="preserve">Von: update the STD and risk management sheet, including acceptance-test results. Due before the Iteration 3 submission.</w:t>
+      </w:r>
+    </w:p>
+    <w:p>
+      <w:pPr>
+        <w:numPr>
+          <w:ilvl w:val="0"/>
+          <w:numId w:val="14"/>
+        </w:numPr>
+        <w:ind w:left="720" w:hanging="360"/>
+        <w:rPr>
+          <w:sz w:val="24"/>
+          <w:szCs w:val="24"/>
+          <w:u w:val="none"/>
+        </w:rPr>
+      </w:pPr>
+      <w:r>
+        <w:rPr>
+          <w:sz w:val="24"/>
+          <w:szCs w:val="24"/>
+          <w:rtl w:val="0"/>
+        </w:rPr>
+        <w:t xml:space="preserve">Nurzat: finalize presentation slides and speaker notes, record assigned presentation and code walkthrough segments, assemble the presentation video, and update meeting minutes. Due before the Iteration 3 submission.</w:t>
+      </w:r>
+    </w:p>
+    <w:p>
+      <w:pPr>
+        <w:numPr>
+          <w:ilvl w:val="0"/>
+          <w:numId w:val="14"/>
+        </w:numPr>
+        <w:ind w:left="720" w:hanging="360"/>
+        <w:rPr>
+          <w:sz w:val="24"/>
+          <w:szCs w:val="24"/>
+          <w:u w:val="none"/>
+        </w:rPr>
+      </w:pPr>
+      <w:r>
+        <w:rPr>
+          <w:sz w:val="24"/>
+          <w:szCs w:val="24"/>
+          <w:rtl w:val="0"/>
+        </w:rPr>
+        <w:t xml:space="preserve">All: provide assigned recordings, update individual progress reports and AI-usage logs, and verify AI-usage headers in contributed code. Due before the Iteration 3 submission.</w:t>
+      </w:r>
+    </w:p>
+    <w:p>
+      <w:pPr>
+        <w:numPr>
+          <w:ilvl w:val="0"/>
+          <w:numId w:val="14"/>
+        </w:numPr>
+        <w:ind w:left="720" w:hanging="360"/>
+        <w:rPr>
+          <w:sz w:val="24"/>
+          <w:szCs w:val="24"/>
+          <w:u w:val="none"/>
+        </w:rPr>
+      </w:pPr>
+      <w:r>
+        <w:rPr>
+          <w:sz w:val="24"/>
+          <w:szCs w:val="24"/>
+          <w:rtl w:val="0"/>
+        </w:rPr>
+        <w:t xml:space="preserve">All: review final deliverables and confirm that submission links work. Due before the Iteration 3 submission.</w:t>
+      </w:r>
+    </w:p>
+    <w:p>
+      <w:pPr>
+        <w:rPr>
+          <w:b w:val="1"/>
+          <w:bCs w:val="1"/>
+          <w:sz w:val="24"/>
+          <w:szCs w:val="24"/>
+        </w:rPr>
+      </w:pPr>
+      <w:r>
+        <w:rPr>
+          <w:rtl w:val="0"/>
+        </w:rPr>
+      </w:r>
+    </w:p>
+    <w:p>
+      <w:pPr>
+        <w:keepNext w:val="0"/>
+        <w:keepLines w:val="0"/>
+        <w:pageBreakBefore w:val="0"/>
+        <w:widowControl w:val="0"/>
+        <w:pBdr>
+          <w:top w:space="0" w:sz="0" w:val="nil"/>
+          <w:left w:space="0" w:sz="0" w:val="nil"/>
+          <w:bottom w:space="0" w:sz="0" w:val="nil"/>
+          <w:right w:space="0" w:sz="0" w:val="nil"/>
+          <w:between w:space="0" w:sz="0" w:val="nil"/>
+        </w:pBdr>
+        <w:shd w:fill="auto" w:val="clear"/>
+        <w:jc w:val="left"/>
+        <w:rPr>
+          <w:b w:val="1"/>
+          <w:bCs w:val="1"/>
+          <w:sz w:val="24"/>
+          <w:szCs w:val="24"/>
+          <w:u w:val="single"/>
+        </w:rPr>
+      </w:pPr>
+      <w:r>
+        <w:rPr>
+          <w:rtl w:val="0"/>
+        </w:rPr>
+      </w:r>
+    </w:p>
+    <w:p>
+      <w:pPr>
+        <w:rPr>
+          <w:sz w:val="24"/>
+          <w:szCs w:val="24"/>
+        </w:rPr>
+      </w:pPr>
+      <w:r>
+        <w:rPr>
+          <w:rtl w:val="0"/>
+        </w:rPr>
+      </w:r>
+    </w:p>
+    <w:p>
+      <w:pPr>
+        <w:keepNext w:val="0"/>
+        <w:keepLines w:val="0"/>
+        <w:pageBreakBefore w:val="0"/>
+        <w:widowControl w:val="0"/>
+        <w:pBdr>
+          <w:top w:space="0" w:sz="0" w:val="nil"/>
+          <w:left w:space="0" w:sz="0" w:val="nil"/>
+          <w:bottom w:space="0" w:sz="0" w:val="nil"/>
+          <w:right w:space="0" w:sz="0" w:val="nil"/>
+          <w:between w:space="0" w:sz="0" w:val="nil"/>
+        </w:pBdr>
+        <w:shd w:fill="auto" w:val="clear"/>
+        <w:rPr>
+          <w:b w:val="1"/>
+          <w:bCs w:val="1"/>
+          <w:sz w:val="24"/>
+          <w:szCs w:val="24"/>
+          <w:u w:val="single"/>
+        </w:rPr>
+      </w:pPr>
+      <w:r>
+        <w:rPr>
+          <w:rtl w:val="0"/>
+        </w:rPr>
+      </w:r>
+    </w:p>
+    <w:p>
+      <w:pPr>
+        <w:jc w:val="center"/>
+        <w:rPr>
+          <w:b w:val="1"/>
+          <w:bCs w:val="1"/>
+          <w:sz w:val="24"/>
+          <w:szCs w:val="24"/>
+          <w:u w:val="single"/>
+        </w:rPr>
+      </w:pPr>
+      <w:r>
+        <w:rPr>
+          <w:b w:val="1"/>
+          <w:bCs w:val="1"/>
+          <w:sz w:val="24"/>
+          <w:szCs w:val="24"/>
+          <w:u w:val="single"/>
+          <w:rtl w:val="0"/>
+        </w:rPr>
         <w:t xml:space="preserve">Meeting 5</w:t>
       </w:r>
     </w:p>
@@ -360,6 +1281,63 @@
     <w:p>
       <w:pPr>
         <w:rPr>
+          <w:b w:val="1"/>
+          <w:bCs w:val="1"/>
+          <w:i w:val="1"/>
+          <w:iCs w:val="1"/>
+          <w:sz w:val="24"/>
+          <w:szCs w:val="24"/>
+          <w:u w:val="single"/>
+        </w:rPr>
+      </w:pPr>
+      <w:r>
+        <w:rPr>
+          <w:b w:val="1"/>
+          <w:bCs w:val="1"/>
+          <w:i w:val="1"/>
+          <w:iCs w:val="1"/>
+          <w:sz w:val="24"/>
+          <w:szCs w:val="24"/>
+          <w:rtl w:val="0"/>
+        </w:rPr>
+        <w:t xml:space="preserve">NOTE TO GRADERS FOR MEETINGS 4 AND 5: </w:t>
+      </w:r>
+      <w:r>
+        <w:rPr>
+          <w:i w:val="1"/>
+          <w:iCs w:val="1"/>
+          <w:sz w:val="24"/>
+          <w:szCs w:val="24"/>
+          <w:rtl w:val="0"/>
+        </w:rPr>
+        <w:t xml:space="preserve">Our team has had difficulty planning synchronous meetings due to some of our team working day jobs taking up full weekdays (Miles) and weekends (Von), and others taking courses covering weeknight evenings (Nurzat and Duc). As such, we have been communicating frequently via Discord and managing team plans via shared markdown files committed to our repo and reviewed across the team via PR before being finalized. We have found that this is an effective way for our team to stay organized and on schedule. We request your understanding in the grading of our meetings.</w:t>
+      </w:r>
+      <w:r>
+        <w:rPr>
+          <w:rtl w:val="0"/>
+        </w:rPr>
+      </w:r>
+    </w:p>
+    <w:p>
+      <w:pPr>
+        <w:jc w:val="center"/>
+        <w:rPr>
+          <w:b w:val="1"/>
+          <w:bCs w:val="1"/>
+          <w:sz w:val="24"/>
+          <w:szCs w:val="24"/>
+          <w:u w:val="single"/>
+        </w:rPr>
+      </w:pPr>
+      <w:r>
+        <w:rPr>
+          <w:rtl w:val="0"/>
+        </w:rPr>
+      </w:r>
+    </w:p>
+    <w:p>
+      <w:pPr>
+        <w:rPr>
           <w:sz w:val="24"/>
           <w:szCs w:val="24"/>
         </w:rPr>
@@ -654,7 +1632,7 @@
       <w:pPr>
         <w:numPr>
           <w:ilvl w:val="0"/>
-          <w:numId w:val="19"/>
+          <w:numId w:val="23"/>
         </w:numPr>
         <w:ind w:left="720" w:hanging="360"/>
         <w:rPr>
@@ -675,7 +1653,7 @@
       <w:pPr>
         <w:numPr>
           <w:ilvl w:val="0"/>
-          <w:numId w:val="19"/>
+          <w:numId w:val="23"/>
         </w:numPr>
         <w:ind w:left="720" w:hanging="360"/>
         <w:rPr>
@@ -696,7 +1674,7 @@
       <w:pPr>
         <w:numPr>
           <w:ilvl w:val="0"/>
-          <w:numId w:val="19"/>
+          <w:numId w:val="23"/>
         </w:numPr>
         <w:ind w:left="720" w:hanging="360"/>
         <w:rPr>
@@ -717,7 +1695,7 @@
       <w:pPr>
         <w:numPr>
           <w:ilvl w:val="0"/>
-          <w:numId w:val="19"/>
+          <w:numId w:val="23"/>
         </w:numPr>
         <w:ind w:left="720" w:hanging="360"/>
         <w:rPr>
@@ -738,7 +1716,7 @@
       <w:pPr>
         <w:numPr>
           <w:ilvl w:val="0"/>
-          <w:numId w:val="19"/>
+          <w:numId w:val="23"/>
         </w:numPr>
         <w:ind w:left="720" w:hanging="360"/>
         <w:rPr>
@@ -759,7 +1737,7 @@
       <w:pPr>
         <w:numPr>
           <w:ilvl w:val="0"/>
-          <w:numId w:val="19"/>
+          <w:numId w:val="23"/>
         </w:numPr>
         <w:ind w:left="720" w:hanging="360"/>
         <w:rPr>
@@ -780,7 +1758,7 @@
       <w:pPr>
         <w:numPr>
           <w:ilvl w:val="0"/>
-          <w:numId w:val="19"/>
+          <w:numId w:val="23"/>
         </w:numPr>
         <w:ind w:left="720" w:hanging="360"/>
         <w:rPr>
@@ -801,7 +1779,7 @@
       <w:pPr>
         <w:numPr>
           <w:ilvl w:val="0"/>
-          <w:numId w:val="19"/>
+          <w:numId w:val="23"/>
         </w:numPr>
         <w:ind w:left="720" w:hanging="360"/>
         <w:rPr>
@@ -822,7 +1800,7 @@
       <w:pPr>
         <w:numPr>
           <w:ilvl w:val="0"/>
-          <w:numId w:val="19"/>
+          <w:numId w:val="23"/>
         </w:numPr>
         <w:ind w:left="720" w:hanging="360"/>
         <w:rPr>
@@ -876,7 +1854,7 @@
       <w:pPr>
         <w:numPr>
           <w:ilvl w:val="0"/>
-          <w:numId w:val="14"/>
+          <w:numId w:val="18"/>
         </w:numPr>
         <w:ind w:left="720" w:hanging="360"/>
         <w:rPr>
@@ -897,7 +1875,7 @@
       <w:pPr>
         <w:numPr>
           <w:ilvl w:val="0"/>
-          <w:numId w:val="14"/>
+          <w:numId w:val="18"/>
         </w:numPr>
         <w:ind w:left="720" w:hanging="360"/>
         <w:rPr>
@@ -918,7 +1896,7 @@
       <w:pPr>
         <w:numPr>
           <w:ilvl w:val="0"/>
-          <w:numId w:val="14"/>
+          <w:numId w:val="18"/>
         </w:numPr>
         <w:ind w:left="720" w:hanging="360"/>
         <w:rPr>
@@ -939,7 +1917,7 @@
       <w:pPr>
         <w:numPr>
           <w:ilvl w:val="0"/>
-          <w:numId w:val="14"/>
+          <w:numId w:val="18"/>
         </w:numPr>
         <w:ind w:left="720" w:hanging="360"/>
         <w:rPr>
@@ -960,7 +1938,7 @@
       <w:pPr>
         <w:numPr>
           <w:ilvl w:val="0"/>
-          <w:numId w:val="14"/>
+          <w:numId w:val="18"/>
         </w:numPr>
         <w:ind w:left="720" w:hanging="360"/>
         <w:rPr>
@@ -981,7 +1959,7 @@
       <w:pPr>
         <w:numPr>
           <w:ilvl w:val="0"/>
-          <w:numId w:val="14"/>
+          <w:numId w:val="18"/>
         </w:numPr>
         <w:ind w:left="720" w:hanging="360"/>
         <w:rPr>
@@ -1002,7 +1980,7 @@
       <w:pPr>
         <w:numPr>
           <w:ilvl w:val="0"/>
-          <w:numId w:val="14"/>
+          <w:numId w:val="18"/>
         </w:numPr>
         <w:ind w:left="720" w:hanging="360"/>
         <w:rPr>
@@ -1023,7 +2001,7 @@
       <w:pPr>
         <w:numPr>
           <w:ilvl w:val="0"/>
-          <w:numId w:val="14"/>
+          <w:numId w:val="18"/>
         </w:numPr>
         <w:ind w:left="720" w:hanging="360"/>
         <w:rPr>
@@ -1044,7 +2022,7 @@
       <w:pPr>
         <w:numPr>
           <w:ilvl w:val="0"/>
-          <w:numId w:val="14"/>
+          <w:numId w:val="18"/>
         </w:numPr>
         <w:ind w:left="720" w:hanging="360"/>
         <w:rPr>
@@ -1065,7 +2043,7 @@
       <w:pPr>
         <w:numPr>
           <w:ilvl w:val="0"/>
-          <w:numId w:val="14"/>
+          <w:numId w:val="18"/>
         </w:numPr>
         <w:ind w:left="720" w:hanging="360"/>
         <w:rPr>
@@ -1121,7 +2099,7 @@
       <w:pPr>
         <w:numPr>
           <w:ilvl w:val="0"/>
-          <w:numId w:val="17"/>
+          <w:numId w:val="21"/>
         </w:numPr>
         <w:ind w:left="720" w:hanging="360"/>
         <w:rPr>
@@ -1142,7 +2120,7 @@
       <w:pPr>
         <w:numPr>
           <w:ilvl w:val="0"/>
-          <w:numId w:val="17"/>
+          <w:numId w:val="21"/>
         </w:numPr>
         <w:ind w:left="720" w:hanging="360"/>
         <w:rPr>
@@ -1163,7 +2141,7 @@
       <w:pPr>
         <w:numPr>
           <w:ilvl w:val="0"/>
-          <w:numId w:val="17"/>
+          <w:numId w:val="21"/>
         </w:numPr>
         <w:ind w:left="720" w:hanging="360"/>
         <w:rPr>
@@ -1184,7 +2162,7 @@
       <w:pPr>
         <w:numPr>
           <w:ilvl w:val="0"/>
-          <w:numId w:val="17"/>
+          <w:numId w:val="21"/>
         </w:numPr>
         <w:ind w:left="720" w:hanging="360"/>
         <w:rPr>
@@ -1205,7 +2183,7 @@
       <w:pPr>
         <w:numPr>
           <w:ilvl w:val="0"/>
-          <w:numId w:val="17"/>
+          <w:numId w:val="21"/>
         </w:numPr>
         <w:ind w:left="720" w:hanging="360"/>
         <w:rPr>
@@ -1226,7 +2204,7 @@
       <w:pPr>
         <w:numPr>
           <w:ilvl w:val="0"/>
-          <w:numId w:val="17"/>
+          <w:numId w:val="21"/>
         </w:numPr>
         <w:ind w:left="720" w:hanging="360"/>
         <w:rPr>
@@ -1691,7 +2669,7 @@
       <w:pPr>
         <w:numPr>
           <w:ilvl w:val="0"/>
-          <w:numId w:val="19"/>
+          <w:numId w:val="23"/>
         </w:numPr>
         <w:ind w:left="720" w:hanging="360"/>
         <w:rPr>
@@ -1712,7 +2690,7 @@
       <w:pPr>
         <w:numPr>
           <w:ilvl w:val="1"/>
-          <w:numId w:val="19"/>
+          <w:numId w:val="23"/>
         </w:numPr>
         <w:ind w:left="1440" w:hanging="360"/>
         <w:rPr>
@@ -1733,7 +2711,7 @@
       <w:pPr>
         <w:numPr>
           <w:ilvl w:val="1"/>
-          <w:numId w:val="19"/>
+          <w:numId w:val="23"/>
         </w:numPr>
         <w:ind w:left="1440" w:hanging="360"/>
         <w:rPr>
@@ -1754,7 +2732,7 @@
       <w:pPr>
         <w:numPr>
           <w:ilvl w:val="1"/>
-          <w:numId w:val="19"/>
+          <w:numId w:val="23"/>
         </w:numPr>
         <w:ind w:left="1440" w:hanging="360"/>
         <w:rPr>
@@ -1775,7 +2753,7 @@
       <w:pPr>
         <w:numPr>
           <w:ilvl w:val="2"/>
-          <w:numId w:val="19"/>
+          <w:numId w:val="23"/>
         </w:numPr>
         <w:ind w:left="2160" w:hanging="360"/>
         <w:rPr>
@@ -1796,7 +2774,7 @@
       <w:pPr>
         <w:numPr>
           <w:ilvl w:val="2"/>
-          <w:numId w:val="19"/>
+          <w:numId w:val="23"/>
         </w:numPr>
         <w:ind w:left="2160" w:hanging="360"/>
         <w:rPr>
@@ -1817,7 +2795,7 @@
       <w:pPr>
         <w:numPr>
           <w:ilvl w:val="2"/>
-          <w:numId w:val="19"/>
+          <w:numId w:val="23"/>
         </w:numPr>
         <w:ind w:left="2160" w:hanging="360"/>
         <w:rPr>
@@ -1838,7 +2816,7 @@
       <w:pPr>
         <w:numPr>
           <w:ilvl w:val="2"/>
-          <w:numId w:val="19"/>
+          <w:numId w:val="23"/>
         </w:numPr>
         <w:ind w:left="2160" w:hanging="360"/>
         <w:rPr>
@@ -1859,7 +2837,7 @@
       <w:pPr>
         <w:numPr>
           <w:ilvl w:val="2"/>
-          <w:numId w:val="19"/>
+          <w:numId w:val="23"/>
         </w:numPr>
         <w:ind w:left="2160" w:hanging="360"/>
         <w:rPr>
@@ -1880,7 +2858,7 @@
       <w:pPr>
         <w:numPr>
           <w:ilvl w:val="1"/>
-          <w:numId w:val="19"/>
+          <w:numId w:val="23"/>
         </w:numPr>
         <w:ind w:left="1440" w:hanging="360"/>
         <w:rPr>
@@ -1901,7 +2879,7 @@
       <w:pPr>
         <w:numPr>
           <w:ilvl w:val="1"/>
-          <w:numId w:val="19"/>
+          <w:numId w:val="23"/>
         </w:numPr>
         <w:ind w:left="1440" w:hanging="360"/>
         <w:rPr>
@@ -1922,7 +2900,7 @@
       <w:pPr>
         <w:numPr>
           <w:ilvl w:val="1"/>
-          <w:numId w:val="19"/>
+          <w:numId w:val="23"/>
         </w:numPr>
         <w:ind w:left="1440" w:hanging="360"/>
         <w:rPr>
@@ -1943,7 +2921,7 @@
       <w:pPr>
         <w:numPr>
           <w:ilvl w:val="1"/>
-          <w:numId w:val="19"/>
+          <w:numId w:val="23"/>
         </w:numPr>
         <w:ind w:left="1440" w:hanging="360"/>
         <w:rPr>
@@ -1964,7 +2942,7 @@
       <w:pPr>
         <w:numPr>
           <w:ilvl w:val="0"/>
-          <w:numId w:val="19"/>
+          <w:numId w:val="23"/>
         </w:numPr>
         <w:ind w:left="720" w:hanging="360"/>
         <w:rPr>
@@ -1986,7 +2964,7 @@
       <w:pPr>
         <w:numPr>
           <w:ilvl w:val="1"/>
-          <w:numId w:val="19"/>
+          <w:numId w:val="23"/>
         </w:numPr>
         <w:ind w:left="1440" w:hanging="360"/>
         <w:rPr>
@@ -2008,7 +2986,7 @@
       <w:pPr>
         <w:numPr>
           <w:ilvl w:val="1"/>
-          <w:numId w:val="19"/>
+          <w:numId w:val="23"/>
         </w:numPr>
         <w:ind w:left="1440" w:hanging="360"/>
         <w:rPr>
@@ -2030,7 +3008,7 @@
       <w:pPr>
         <w:numPr>
           <w:ilvl w:val="1"/>
-          <w:numId w:val="19"/>
+          <w:numId w:val="23"/>
         </w:numPr>
         <w:ind w:left="1440" w:hanging="360"/>
         <w:rPr>
@@ -2052,7 +3030,7 @@
       <w:pPr>
         <w:numPr>
           <w:ilvl w:val="1"/>
-          <w:numId w:val="19"/>
+          <w:numId w:val="23"/>
         </w:numPr>
         <w:ind w:left="1440" w:hanging="360"/>
         <w:rPr>
@@ -2074,7 +3052,7 @@
       <w:pPr>
         <w:numPr>
           <w:ilvl w:val="0"/>
-          <w:numId w:val="19"/>
+          <w:numId w:val="23"/>
         </w:numPr>
         <w:ind w:left="720" w:hanging="360"/>
         <w:rPr>
@@ -2096,7 +3074,7 @@
       <w:pPr>
         <w:numPr>
           <w:ilvl w:val="1"/>
-          <w:numId w:val="19"/>
+          <w:numId w:val="23"/>
         </w:numPr>
         <w:ind w:left="1440" w:hanging="360"/>
         <w:rPr>
@@ -2118,7 +3096,7 @@
       <w:pPr>
         <w:numPr>
           <w:ilvl w:val="1"/>
-          <w:numId w:val="19"/>
+          <w:numId w:val="23"/>
         </w:numPr>
         <w:ind w:left="1440" w:hanging="360"/>
         <w:rPr>
@@ -2140,7 +3118,7 @@
       <w:pPr>
         <w:numPr>
           <w:ilvl w:val="1"/>
-          <w:numId w:val="19"/>
+          <w:numId w:val="23"/>
         </w:numPr>
         <w:ind w:left="1440" w:hanging="360"/>
         <w:rPr>
@@ -2162,7 +3140,7 @@
       <w:pPr>
         <w:numPr>
           <w:ilvl w:val="0"/>
-          <w:numId w:val="19"/>
+          <w:numId w:val="23"/>
         </w:numPr>
         <w:ind w:left="720" w:hanging="360"/>
         <w:rPr>
@@ -2184,7 +3162,7 @@
       <w:pPr>
         <w:numPr>
           <w:ilvl w:val="1"/>
-          <w:numId w:val="19"/>
+          <w:numId w:val="23"/>
         </w:numPr>
         <w:ind w:left="1440" w:hanging="360"/>
         <w:rPr>
@@ -2206,7 +3184,7 @@
       <w:pPr>
         <w:numPr>
           <w:ilvl w:val="1"/>
-          <w:numId w:val="19"/>
+          <w:numId w:val="23"/>
         </w:numPr>
         <w:ind w:left="1440" w:hanging="360"/>
         <w:rPr>
@@ -2228,7 +3206,7 @@
       <w:pPr>
         <w:numPr>
           <w:ilvl w:val="1"/>
-          <w:numId w:val="19"/>
+          <w:numId w:val="23"/>
         </w:numPr>
         <w:ind w:left="1440" w:hanging="360"/>
         <w:rPr>
@@ -2250,7 +3228,7 @@
       <w:pPr>
         <w:numPr>
           <w:ilvl w:val="0"/>
-          <w:numId w:val="19"/>
+          <w:numId w:val="23"/>
         </w:numPr>
         <w:ind w:left="720" w:hanging="360"/>
         <w:rPr>
@@ -2272,7 +3250,7 @@
       <w:pPr>
         <w:numPr>
           <w:ilvl w:val="1"/>
-          <w:numId w:val="19"/>
+          <w:numId w:val="23"/>
         </w:numPr>
         <w:ind w:left="1440" w:hanging="360"/>
         <w:rPr>
@@ -2294,7 +3272,7 @@
       <w:pPr>
         <w:numPr>
           <w:ilvl w:val="1"/>
-          <w:numId w:val="19"/>
+          <w:numId w:val="23"/>
         </w:numPr>
         <w:ind w:left="1440" w:hanging="360"/>
         <w:rPr>
@@ -2316,7 +3294,7 @@
       <w:pPr>
         <w:numPr>
           <w:ilvl w:val="1"/>
-          <w:numId w:val="19"/>
+          <w:numId w:val="23"/>
         </w:numPr>
         <w:ind w:left="1440" w:hanging="360"/>
         <w:rPr>
@@ -2338,7 +3316,7 @@
       <w:pPr>
         <w:numPr>
           <w:ilvl w:val="1"/>
-          <w:numId w:val="19"/>
+          <w:numId w:val="23"/>
         </w:numPr>
         <w:ind w:left="1440" w:hanging="360"/>
         <w:rPr>
@@ -2360,7 +3338,7 @@
       <w:pPr>
         <w:numPr>
           <w:ilvl w:val="1"/>
-          <w:numId w:val="19"/>
+          <w:numId w:val="23"/>
         </w:numPr>
         <w:ind w:left="1440" w:hanging="360"/>
         <w:rPr>
@@ -2832,7 +3810,7 @@
       <w:pPr>
         <w:numPr>
           <w:ilvl w:val="0"/>
-          <w:numId w:val="18"/>
+          <w:numId w:val="22"/>
         </w:numPr>
         <w:ind w:left="720" w:hanging="360"/>
         <w:rPr>
@@ -2853,7 +3831,7 @@
       <w:pPr>
         <w:numPr>
           <w:ilvl w:val="0"/>
-          <w:numId w:val="18"/>
+          <w:numId w:val="22"/>
         </w:numPr>
         <w:ind w:left="720" w:hanging="360"/>
         <w:rPr>
@@ -2874,7 +3852,7 @@
       <w:pPr>
         <w:numPr>
           <w:ilvl w:val="0"/>
-          <w:numId w:val="18"/>
+          <w:numId w:val="22"/>
         </w:numPr>
         <w:ind w:left="720" w:hanging="360"/>
         <w:rPr>
@@ -2895,7 +3873,7 @@
       <w:pPr>
         <w:numPr>
           <w:ilvl w:val="0"/>
-          <w:numId w:val="18"/>
+          <w:numId w:val="22"/>
         </w:numPr>
         <w:ind w:left="720" w:hanging="360"/>
         <w:rPr>
@@ -2916,7 +3894,7 @@
       <w:pPr>
         <w:numPr>
           <w:ilvl w:val="0"/>
-          <w:numId w:val="18"/>
+          <w:numId w:val="22"/>
         </w:numPr>
         <w:ind w:left="720" w:hanging="360"/>
         <w:rPr>
@@ -2937,7 +3915,7 @@
       <w:pPr>
         <w:numPr>
           <w:ilvl w:val="0"/>
-          <w:numId w:val="18"/>
+          <w:numId w:val="22"/>
         </w:numPr>
         <w:ind w:left="720" w:hanging="360"/>
         <w:rPr>
@@ -2958,7 +3936,7 @@
       <w:pPr>
         <w:numPr>
           <w:ilvl w:val="0"/>
-          <w:numId w:val="18"/>
+          <w:numId w:val="22"/>
         </w:numPr>
         <w:ind w:left="720" w:hanging="360"/>
         <w:rPr>
@@ -2979,7 +3957,7 @@
       <w:pPr>
         <w:numPr>
           <w:ilvl w:val="0"/>
-          <w:numId w:val="18"/>
+          <w:numId w:val="22"/>
         </w:numPr>
         <w:ind w:left="720" w:hanging="360"/>
         <w:rPr>
@@ -3000,7 +3978,7 @@
       <w:pPr>
         <w:numPr>
           <w:ilvl w:val="0"/>
-          <w:numId w:val="18"/>
+          <w:numId w:val="22"/>
         </w:numPr>
         <w:ind w:left="720" w:hanging="360"/>
         <w:rPr>
@@ -3021,7 +3999,7 @@
       <w:pPr>
         <w:numPr>
           <w:ilvl w:val="0"/>
-          <w:numId w:val="18"/>
+          <w:numId w:val="22"/>
         </w:numPr>
         <w:ind w:left="720" w:hanging="360"/>
         <w:rPr>
@@ -3042,7 +4020,7 @@
       <w:pPr>
         <w:numPr>
           <w:ilvl w:val="0"/>
-          <w:numId w:val="18"/>
+          <w:numId w:val="22"/>
         </w:numPr>
         <w:ind w:left="720" w:hanging="360"/>
         <w:rPr>
@@ -3240,7 +4218,7 @@
           <w:szCs w:val="24"/>
           <w:rtl w:val="0"/>
         </w:rPr>
-        <w:t xml:space="preserve">  Thursday September 12, 2026 - 4:30pm EDT</w:t>
+        <w:t xml:space="preserve">  Thursday September 17, 2026 - 4:30pm EDT</w:t>
       </w:r>
     </w:p>
     <w:p>
@@ -3531,7 +4509,7 @@
       <w:pPr>
         <w:numPr>
           <w:ilvl w:val="0"/>
-          <w:numId w:val="19"/>
+          <w:numId w:val="23"/>
         </w:numPr>
         <w:ind w:left="720" w:hanging="360"/>
         <w:rPr>
@@ -3552,7 +4530,7 @@
       <w:pPr>
         <w:numPr>
           <w:ilvl w:val="0"/>
-          <w:numId w:val="19"/>
+          <w:numId w:val="23"/>
         </w:numPr>
         <w:ind w:left="720" w:hanging="360"/>
         <w:rPr>
@@ -3573,7 +4551,7 @@
       <w:pPr>
         <w:numPr>
           <w:ilvl w:val="0"/>
-          <w:numId w:val="19"/>
+          <w:numId w:val="23"/>
         </w:numPr>
         <w:ind w:left="720" w:hanging="360"/>
         <w:rPr>
@@ -3594,7 +4572,7 @@
       <w:pPr>
         <w:numPr>
           <w:ilvl w:val="0"/>
-          <w:numId w:val="19"/>
+          <w:numId w:val="23"/>
         </w:numPr>
         <w:ind w:left="720" w:hanging="360"/>
         <w:rPr>
@@ -3615,7 +4593,7 @@
       <w:pPr>
         <w:numPr>
           <w:ilvl w:val="0"/>
-          <w:numId w:val="19"/>
+          <w:numId w:val="23"/>
         </w:numPr>
         <w:ind w:left="720" w:hanging="360"/>
         <w:rPr>
@@ -3636,7 +4614,7 @@
       <w:pPr>
         <w:numPr>
           <w:ilvl w:val="0"/>
-          <w:numId w:val="19"/>
+          <w:numId w:val="23"/>
         </w:numPr>
         <w:ind w:left="720" w:hanging="360"/>
         <w:rPr>
@@ -3657,7 +4635,7 @@
       <w:pPr>
         <w:numPr>
           <w:ilvl w:val="0"/>
-          <w:numId w:val="19"/>
+          <w:numId w:val="23"/>
         </w:numPr>
         <w:ind w:left="720" w:hanging="360"/>
         <w:rPr>
@@ -3740,7 +4718,7 @@
       <w:pPr>
         <w:numPr>
           <w:ilvl w:val="0"/>
-          <w:numId w:val="7"/>
+          <w:numId w:val="8"/>
         </w:numPr>
         <w:ind w:left="720" w:hanging="360"/>
         <w:rPr>
@@ -3761,7 +4739,7 @@
       <w:pPr>
         <w:numPr>
           <w:ilvl w:val="0"/>
-          <w:numId w:val="7"/>
+          <w:numId w:val="8"/>
         </w:numPr>
         <w:ind w:left="720" w:hanging="360"/>
         <w:rPr>
@@ -3782,7 +4760,7 @@
       <w:pPr>
         <w:numPr>
           <w:ilvl w:val="0"/>
-          <w:numId w:val="7"/>
+          <w:numId w:val="8"/>
         </w:numPr>
         <w:ind w:left="720" w:hanging="360"/>
         <w:rPr>
@@ -3803,7 +4781,7 @@
       <w:pPr>
         <w:numPr>
           <w:ilvl w:val="0"/>
-          <w:numId w:val="7"/>
+          <w:numId w:val="8"/>
         </w:numPr>
         <w:ind w:left="720" w:hanging="360"/>
         <w:rPr>
@@ -3824,7 +4802,7 @@
       <w:pPr>
         <w:numPr>
           <w:ilvl w:val="1"/>
-          <w:numId w:val="7"/>
+          <w:numId w:val="8"/>
         </w:numPr>
         <w:ind w:left="1440" w:hanging="360"/>
         <w:rPr>
@@ -3845,7 +4823,7 @@
       <w:pPr>
         <w:numPr>
           <w:ilvl w:val="1"/>
-          <w:numId w:val="7"/>
+          <w:numId w:val="8"/>
         </w:numPr>
         <w:ind w:left="1440" w:hanging="360"/>
         <w:rPr>
@@ -3866,7 +4844,7 @@
       <w:pPr>
         <w:numPr>
           <w:ilvl w:val="1"/>
-          <w:numId w:val="7"/>
+          <w:numId w:val="8"/>
         </w:numPr>
         <w:ind w:left="1440" w:hanging="360"/>
         <w:rPr>
@@ -3887,7 +4865,7 @@
       <w:pPr>
         <w:numPr>
           <w:ilvl w:val="1"/>
-          <w:numId w:val="7"/>
+          <w:numId w:val="8"/>
         </w:numPr>
         <w:ind w:left="1440" w:hanging="360"/>
         <w:rPr>
@@ -3908,7 +4886,7 @@
       <w:pPr>
         <w:numPr>
           <w:ilvl w:val="0"/>
-          <w:numId w:val="7"/>
+          <w:numId w:val="8"/>
         </w:numPr>
         <w:ind w:left="720" w:hanging="360"/>
         <w:rPr>
@@ -3929,7 +4907,7 @@
       <w:pPr>
         <w:numPr>
           <w:ilvl w:val="1"/>
-          <w:numId w:val="7"/>
+          <w:numId w:val="8"/>
         </w:numPr>
         <w:ind w:left="1440" w:hanging="360"/>
         <w:rPr>
@@ -3950,7 +4928,7 @@
       <w:pPr>
         <w:numPr>
           <w:ilvl w:val="2"/>
-          <w:numId w:val="7"/>
+          <w:numId w:val="8"/>
         </w:numPr>
         <w:ind w:left="2160" w:hanging="360"/>
         <w:rPr>
@@ -3971,7 +4949,7 @@
       <w:pPr>
         <w:numPr>
           <w:ilvl w:val="2"/>
-          <w:numId w:val="7"/>
+          <w:numId w:val="8"/>
         </w:numPr>
         <w:ind w:left="2160" w:hanging="360"/>
         <w:rPr>
@@ -3992,7 +4970,7 @@
       <w:pPr>
         <w:numPr>
           <w:ilvl w:val="0"/>
-          <w:numId w:val="7"/>
+          <w:numId w:val="8"/>
         </w:numPr>
         <w:ind w:left="720" w:hanging="360"/>
         <w:rPr>
@@ -4013,7 +4991,7 @@
       <w:pPr>
         <w:numPr>
           <w:ilvl w:val="0"/>
-          <w:numId w:val="7"/>
+          <w:numId w:val="8"/>
         </w:numPr>
         <w:ind w:left="720" w:hanging="360"/>
         <w:rPr>
@@ -4281,7 +5259,7 @@
           <w:szCs w:val="24"/>
           <w:rtl w:val="0"/>
         </w:rPr>
-        <w:t xml:space="preserve">Vaughn — implement frontend user authentication (login/signup) — due Mon AM</w:t>
+        <w:t xml:space="preserve">Von — implement frontend user authentication (login/signup) — due Mon AM</w:t>
       </w:r>
     </w:p>
     <w:p>
@@ -4773,7 +5751,7 @@
       <w:pPr>
         <w:numPr>
           <w:ilvl w:val="0"/>
-          <w:numId w:val="11"/>
+          <w:numId w:val="13"/>
         </w:numPr>
         <w:spacing w:after="0" w:afterAutospacing="0" w:before="240" w:lineRule="auto"/>
         <w:ind w:left="1440" w:hanging="360"/>
@@ -4795,7 +5773,7 @@
       <w:pPr>
         <w:numPr>
           <w:ilvl w:val="0"/>
-          <w:numId w:val="11"/>
+          <w:numId w:val="13"/>
         </w:numPr>
         <w:spacing w:after="0" w:afterAutospacing="0" w:before="0" w:beforeAutospacing="0" w:lineRule="auto"/>
         <w:ind w:left="1440" w:hanging="360"/>
@@ -4818,7 +5796,7 @@
       <w:pPr>
         <w:numPr>
           <w:ilvl w:val="0"/>
-          <w:numId w:val="11"/>
+          <w:numId w:val="13"/>
         </w:numPr>
         <w:spacing w:after="0" w:afterAutospacing="0" w:before="0" w:beforeAutospacing="0" w:lineRule="auto"/>
         <w:ind w:left="1440" w:hanging="360"/>
@@ -4840,7 +5818,7 @@
       <w:pPr>
         <w:numPr>
           <w:ilvl w:val="0"/>
-          <w:numId w:val="11"/>
+          <w:numId w:val="13"/>
         </w:numPr>
         <w:spacing w:after="0" w:afterAutospacing="0" w:before="0" w:beforeAutospacing="0" w:lineRule="auto"/>
         <w:ind w:left="1440" w:hanging="360"/>
@@ -4862,7 +5840,7 @@
       <w:pPr>
         <w:numPr>
           <w:ilvl w:val="0"/>
-          <w:numId w:val="11"/>
+          <w:numId w:val="13"/>
         </w:numPr>
         <w:spacing w:after="240" w:before="0" w:beforeAutospacing="0" w:lineRule="auto"/>
         <w:ind w:left="1440" w:hanging="360"/>
@@ -5185,7 +6163,7 @@
       <w:pPr>
         <w:numPr>
           <w:ilvl w:val="0"/>
-          <w:numId w:val="9"/>
+          <w:numId w:val="11"/>
         </w:numPr>
         <w:spacing w:after="0" w:afterAutospacing="0" w:before="0" w:lineRule="auto"/>
         <w:ind w:left="1440" w:hanging="360"/>
@@ -5207,7 +6185,7 @@
       <w:pPr>
         <w:numPr>
           <w:ilvl w:val="0"/>
-          <w:numId w:val="9"/>
+          <w:numId w:val="11"/>
         </w:numPr>
         <w:spacing w:after="0" w:afterAutospacing="0" w:before="0" w:beforeAutospacing="0" w:lineRule="auto"/>
         <w:ind w:left="1440" w:hanging="360"/>
@@ -5229,7 +6207,7 @@
       <w:pPr>
         <w:numPr>
           <w:ilvl w:val="1"/>
-          <w:numId w:val="9"/>
+          <w:numId w:val="11"/>
         </w:numPr>
         <w:spacing w:after="0" w:afterAutospacing="0" w:before="0" w:beforeAutospacing="0" w:lineRule="auto"/>
         <w:ind w:left="2160" w:hanging="360"/>
@@ -5260,7 +6238,7 @@
       <w:pPr>
         <w:numPr>
           <w:ilvl w:val="1"/>
-          <w:numId w:val="9"/>
+          <w:numId w:val="11"/>
         </w:numPr>
         <w:spacing w:after="0" w:afterAutospacing="0" w:before="0" w:beforeAutospacing="0" w:lineRule="auto"/>
         <w:ind w:left="2160" w:hanging="360"/>
@@ -5307,7 +6285,7 @@
       <w:pPr>
         <w:numPr>
           <w:ilvl w:val="1"/>
-          <w:numId w:val="9"/>
+          <w:numId w:val="11"/>
         </w:numPr>
         <w:spacing w:after="0" w:afterAutospacing="0" w:before="0" w:beforeAutospacing="0" w:lineRule="auto"/>
         <w:ind w:left="2160" w:hanging="360"/>
@@ -5329,7 +6307,7 @@
       <w:pPr>
         <w:numPr>
           <w:ilvl w:val="0"/>
-          <w:numId w:val="9"/>
+          <w:numId w:val="11"/>
         </w:numPr>
         <w:spacing w:after="0" w:afterAutospacing="0" w:before="0" w:beforeAutospacing="0" w:lineRule="auto"/>
         <w:ind w:left="1440" w:hanging="360"/>
@@ -5351,7 +6329,7 @@
       <w:pPr>
         <w:numPr>
           <w:ilvl w:val="0"/>
-          <w:numId w:val="9"/>
+          <w:numId w:val="11"/>
         </w:numPr>
         <w:spacing w:after="0" w:afterAutospacing="0" w:before="0" w:beforeAutospacing="0" w:lineRule="auto"/>
         <w:ind w:left="1440" w:hanging="360"/>
@@ -5373,7 +6351,7 @@
       <w:pPr>
         <w:numPr>
           <w:ilvl w:val="0"/>
-          <w:numId w:val="9"/>
+          <w:numId w:val="11"/>
         </w:numPr>
         <w:spacing w:after="240" w:before="0" w:beforeAutospacing="0" w:lineRule="auto"/>
         <w:ind w:left="1440" w:hanging="360"/>
@@ -5417,7 +6395,7 @@
       <w:pPr>
         <w:numPr>
           <w:ilvl w:val="0"/>
-          <w:numId w:val="13"/>
+          <w:numId w:val="16"/>
         </w:numPr>
         <w:spacing w:after="0" w:before="0" w:lineRule="auto"/>
         <w:ind w:left="1440" w:hanging="360"/>
@@ -5439,7 +6417,7 @@
       <w:pPr>
         <w:numPr>
           <w:ilvl w:val="0"/>
-          <w:numId w:val="13"/>
+          <w:numId w:val="16"/>
         </w:numPr>
         <w:spacing w:after="0" w:before="0" w:lineRule="auto"/>
         <w:ind w:left="1440" w:hanging="360"/>
@@ -5461,7 +6439,7 @@
       <w:pPr>
         <w:numPr>
           <w:ilvl w:val="0"/>
-          <w:numId w:val="13"/>
+          <w:numId w:val="16"/>
         </w:numPr>
         <w:spacing w:after="0" w:before="0" w:lineRule="auto"/>
         <w:ind w:left="1440" w:hanging="360"/>
@@ -5520,7 +6498,7 @@
       <w:pPr>
         <w:numPr>
           <w:ilvl w:val="0"/>
-          <w:numId w:val="10"/>
+          <w:numId w:val="12"/>
         </w:numPr>
         <w:spacing w:after="0" w:afterAutospacing="0" w:before="0" w:lineRule="auto"/>
         <w:ind w:left="1440" w:hanging="360"/>
@@ -5542,7 +6520,7 @@
       <w:pPr>
         <w:numPr>
           <w:ilvl w:val="0"/>
-          <w:numId w:val="10"/>
+          <w:numId w:val="12"/>
         </w:numPr>
         <w:spacing w:after="0" w:afterAutospacing="0" w:before="0" w:beforeAutospacing="0" w:lineRule="auto"/>
         <w:ind w:left="1440" w:hanging="360"/>
@@ -5564,7 +6542,7 @@
       <w:pPr>
         <w:numPr>
           <w:ilvl w:val="0"/>
-          <w:numId w:val="10"/>
+          <w:numId w:val="12"/>
         </w:numPr>
         <w:spacing w:after="0" w:afterAutospacing="0" w:before="0" w:beforeAutospacing="0" w:lineRule="auto"/>
         <w:ind w:left="1440" w:hanging="360"/>
@@ -5586,7 +6564,7 @@
       <w:pPr>
         <w:numPr>
           <w:ilvl w:val="0"/>
-          <w:numId w:val="10"/>
+          <w:numId w:val="12"/>
         </w:numPr>
         <w:spacing w:after="240" w:before="0" w:beforeAutospacing="0" w:lineRule="auto"/>
         <w:ind w:left="1440" w:hanging="360"/>
@@ -5740,7 +6718,7 @@
       <w:pPr>
         <w:numPr>
           <w:ilvl w:val="0"/>
-          <w:numId w:val="12"/>
+          <w:numId w:val="15"/>
         </w:numPr>
         <w:spacing w:after="0" w:before="0" w:lineRule="auto"/>
         <w:ind w:left="1440" w:hanging="360"/>
@@ -5762,7 +6740,7 @@
       <w:pPr>
         <w:numPr>
           <w:ilvl w:val="0"/>
-          <w:numId w:val="12"/>
+          <w:numId w:val="15"/>
         </w:numPr>
         <w:spacing w:after="0" w:afterAutospacing="0" w:before="0" w:lineRule="auto"/>
         <w:ind w:left="1440" w:hanging="360"/>
@@ -5784,7 +6762,7 @@
       <w:pPr>
         <w:numPr>
           <w:ilvl w:val="1"/>
-          <w:numId w:val="12"/>
+          <w:numId w:val="15"/>
         </w:numPr>
         <w:spacing w:after="0" w:afterAutospacing="0" w:before="0" w:beforeAutospacing="0" w:lineRule="auto"/>
         <w:ind w:left="2160" w:hanging="360"/>
@@ -5806,7 +6784,7 @@
       <w:pPr>
         <w:numPr>
           <w:ilvl w:val="1"/>
-          <w:numId w:val="12"/>
+          <w:numId w:val="15"/>
         </w:numPr>
         <w:spacing w:after="0" w:afterAutospacing="0" w:before="0" w:beforeAutospacing="0" w:lineRule="auto"/>
         <w:ind w:left="2160" w:hanging="360"/>
@@ -5828,7 +6806,7 @@
       <w:pPr>
         <w:numPr>
           <w:ilvl w:val="1"/>
-          <w:numId w:val="12"/>
+          <w:numId w:val="15"/>
         </w:numPr>
         <w:spacing w:after="0" w:afterAutospacing="0" w:before="0" w:beforeAutospacing="0" w:lineRule="auto"/>
         <w:ind w:left="2160" w:hanging="360"/>
@@ -5850,7 +6828,7 @@
       <w:pPr>
         <w:numPr>
           <w:ilvl w:val="1"/>
-          <w:numId w:val="12"/>
+          <w:numId w:val="15"/>
         </w:numPr>
         <w:spacing w:after="0" w:afterAutospacing="0" w:before="0" w:beforeAutospacing="0" w:lineRule="auto"/>
         <w:ind w:left="2160" w:hanging="360"/>
@@ -5872,7 +6850,7 @@
       <w:pPr>
         <w:numPr>
           <w:ilvl w:val="1"/>
-          <w:numId w:val="12"/>
+          <w:numId w:val="15"/>
         </w:numPr>
         <w:spacing w:after="0" w:afterAutospacing="0" w:before="0" w:beforeAutospacing="0" w:lineRule="auto"/>
         <w:ind w:left="2160" w:hanging="360"/>
@@ -5894,7 +6872,7 @@
       <w:pPr>
         <w:numPr>
           <w:ilvl w:val="0"/>
-          <w:numId w:val="12"/>
+          <w:numId w:val="15"/>
         </w:numPr>
         <w:spacing w:after="0" w:afterAutospacing="0" w:before="0" w:beforeAutospacing="0" w:lineRule="auto"/>
         <w:ind w:left="1440" w:hanging="360"/>
@@ -5916,7 +6894,7 @@
       <w:pPr>
         <w:numPr>
           <w:ilvl w:val="0"/>
-          <w:numId w:val="12"/>
+          <w:numId w:val="15"/>
         </w:numPr>
         <w:spacing w:after="240" w:before="0" w:beforeAutospacing="0" w:lineRule="auto"/>
         <w:ind w:left="1440" w:hanging="360"/>
@@ -7037,7 +8015,7 @@
       <w:pPr>
         <w:numPr>
           <w:ilvl w:val="0"/>
-          <w:numId w:val="16"/>
+          <w:numId w:val="20"/>
         </w:numPr>
         <w:ind w:left="720" w:hanging="360"/>
         <w:rPr>
@@ -7058,7 +8036,7 @@
       <w:pPr>
         <w:numPr>
           <w:ilvl w:val="1"/>
-          <w:numId w:val="16"/>
+          <w:numId w:val="20"/>
         </w:numPr>
         <w:ind w:left="1440" w:hanging="360"/>
         <w:rPr>
@@ -7084,7 +8062,7 @@
         <w:widowControl w:val="0"/>
         <w:numPr>
           <w:ilvl w:val="0"/>
-          <w:numId w:val="16"/>
+          <w:numId w:val="20"/>
         </w:numPr>
         <w:pBdr>
           <w:top w:space="0" w:sz="0" w:val="nil"/>
@@ -7117,7 +8095,7 @@
         <w:widowControl w:val="0"/>
         <w:numPr>
           <w:ilvl w:val="1"/>
-          <w:numId w:val="16"/>
+          <w:numId w:val="20"/>
         </w:numPr>
         <w:pBdr>
           <w:top w:space="0" w:sz="0" w:val="nil"/>
@@ -7151,7 +8129,7 @@
         <w:widowControl w:val="0"/>
         <w:numPr>
           <w:ilvl w:val="1"/>
-          <w:numId w:val="16"/>
+          <w:numId w:val="20"/>
         </w:numPr>
         <w:pBdr>
           <w:top w:space="0" w:sz="0" w:val="nil"/>
@@ -7185,7 +8163,7 @@
         <w:widowControl w:val="0"/>
         <w:numPr>
           <w:ilvl w:val="1"/>
-          <w:numId w:val="16"/>
+          <w:numId w:val="20"/>
         </w:numPr>
         <w:pBdr>
           <w:top w:space="0" w:sz="0" w:val="nil"/>
@@ -7215,7 +8193,7 @@
       <w:pPr>
         <w:numPr>
           <w:ilvl w:val="1"/>
-          <w:numId w:val="16"/>
+          <w:numId w:val="20"/>
         </w:numPr>
         <w:ind w:left="1440" w:hanging="360"/>
         <w:rPr>
@@ -7240,7 +8218,7 @@
         <w:widowControl w:val="0"/>
         <w:numPr>
           <w:ilvl w:val="1"/>
-          <w:numId w:val="16"/>
+          <w:numId w:val="20"/>
         </w:numPr>
         <w:pBdr>
           <w:top w:space="0" w:sz="0" w:val="nil"/>
@@ -7274,7 +8252,7 @@
         <w:widowControl w:val="0"/>
         <w:numPr>
           <w:ilvl w:val="0"/>
-          <w:numId w:val="16"/>
+          <w:numId w:val="20"/>
         </w:numPr>
         <w:pBdr>
           <w:top w:space="0" w:sz="0" w:val="nil"/>
@@ -7307,7 +8285,7 @@
         <w:widowControl w:val="0"/>
         <w:numPr>
           <w:ilvl w:val="1"/>
-          <w:numId w:val="16"/>
+          <w:numId w:val="20"/>
         </w:numPr>
         <w:pBdr>
           <w:top w:space="0" w:sz="0" w:val="nil"/>
@@ -7341,7 +8319,7 @@
         <w:widowControl w:val="0"/>
         <w:numPr>
           <w:ilvl w:val="1"/>
-          <w:numId w:val="16"/>
+          <w:numId w:val="20"/>
         </w:numPr>
         <w:pBdr>
           <w:top w:space="0" w:sz="0" w:val="nil"/>
@@ -7375,7 +8353,7 @@
         <w:widowControl w:val="0"/>
         <w:numPr>
           <w:ilvl w:val="0"/>
-          <w:numId w:val="16"/>
+          <w:numId w:val="20"/>
         </w:numPr>
         <w:pBdr>
           <w:top w:space="0" w:sz="0" w:val="nil"/>
@@ -7450,7 +8428,7 @@
       <w:pPr>
         <w:numPr>
           <w:ilvl w:val="0"/>
-          <w:numId w:val="8"/>
+          <w:numId w:val="9"/>
         </w:numPr>
         <w:spacing w:after="0" w:afterAutospacing="0" w:before="240" w:lineRule="auto"/>
         <w:ind w:left="720" w:hanging="360"/>
@@ -7474,7 +8452,7 @@
       <w:pPr>
         <w:numPr>
           <w:ilvl w:val="1"/>
-          <w:numId w:val="8"/>
+          <w:numId w:val="9"/>
         </w:numPr>
         <w:spacing w:after="0" w:afterAutospacing="0" w:before="0" w:beforeAutospacing="0" w:lineRule="auto"/>
         <w:ind w:left="1440" w:hanging="360"/>
@@ -7496,7 +8474,7 @@
       <w:pPr>
         <w:numPr>
           <w:ilvl w:val="1"/>
-          <w:numId w:val="8"/>
+          <w:numId w:val="9"/>
         </w:numPr>
         <w:spacing w:after="0" w:afterAutospacing="0" w:before="0" w:beforeAutospacing="0" w:lineRule="auto"/>
         <w:ind w:left="1440" w:hanging="360"/>
@@ -7518,7 +8496,7 @@
       <w:pPr>
         <w:numPr>
           <w:ilvl w:val="1"/>
-          <w:numId w:val="8"/>
+          <w:numId w:val="9"/>
         </w:numPr>
         <w:spacing w:after="0" w:afterAutospacing="0" w:before="0" w:beforeAutospacing="0" w:lineRule="auto"/>
         <w:ind w:left="1440" w:hanging="360"/>
@@ -7540,7 +8518,7 @@
       <w:pPr>
         <w:numPr>
           <w:ilvl w:val="1"/>
-          <w:numId w:val="8"/>
+          <w:numId w:val="9"/>
         </w:numPr>
         <w:spacing w:after="0" w:afterAutospacing="0" w:before="0" w:beforeAutospacing="0" w:lineRule="auto"/>
         <w:ind w:left="1440" w:hanging="360"/>
@@ -7562,7 +8540,7 @@
       <w:pPr>
         <w:numPr>
           <w:ilvl w:val="0"/>
-          <w:numId w:val="8"/>
+          <w:numId w:val="9"/>
         </w:numPr>
         <w:spacing w:after="0" w:afterAutospacing="0" w:before="0" w:beforeAutospacing="0" w:lineRule="auto"/>
         <w:ind w:left="720" w:hanging="360"/>
@@ -7586,7 +8564,7 @@
       <w:pPr>
         <w:numPr>
           <w:ilvl w:val="1"/>
-          <w:numId w:val="8"/>
+          <w:numId w:val="9"/>
         </w:numPr>
         <w:spacing w:after="0" w:afterAutospacing="0" w:before="0" w:beforeAutospacing="0" w:lineRule="auto"/>
         <w:ind w:left="1440" w:hanging="360"/>
@@ -7608,7 +8586,7 @@
       <w:pPr>
         <w:numPr>
           <w:ilvl w:val="1"/>
-          <w:numId w:val="8"/>
+          <w:numId w:val="9"/>
         </w:numPr>
         <w:spacing w:after="0" w:afterAutospacing="0" w:before="0" w:beforeAutospacing="0" w:lineRule="auto"/>
         <w:ind w:left="1440" w:hanging="360"/>
@@ -7630,7 +8608,7 @@
       <w:pPr>
         <w:numPr>
           <w:ilvl w:val="1"/>
-          <w:numId w:val="8"/>
+          <w:numId w:val="9"/>
         </w:numPr>
         <w:spacing w:after="0" w:afterAutospacing="0" w:before="0" w:beforeAutospacing="0" w:lineRule="auto"/>
         <w:ind w:left="1440" w:hanging="360"/>
@@ -7652,7 +8630,7 @@
       <w:pPr>
         <w:numPr>
           <w:ilvl w:val="1"/>
-          <w:numId w:val="8"/>
+          <w:numId w:val="9"/>
         </w:numPr>
         <w:spacing w:after="0" w:afterAutospacing="0" w:before="0" w:beforeAutospacing="0" w:lineRule="auto"/>
         <w:ind w:left="1440" w:hanging="360"/>
@@ -7674,7 +8652,7 @@
       <w:pPr>
         <w:numPr>
           <w:ilvl w:val="1"/>
-          <w:numId w:val="8"/>
+          <w:numId w:val="9"/>
         </w:numPr>
         <w:spacing w:after="0" w:afterAutospacing="0" w:before="0" w:beforeAutospacing="0" w:lineRule="auto"/>
         <w:ind w:left="1440" w:hanging="360"/>
@@ -7696,7 +8674,7 @@
       <w:pPr>
         <w:numPr>
           <w:ilvl w:val="1"/>
-          <w:numId w:val="8"/>
+          <w:numId w:val="9"/>
         </w:numPr>
         <w:spacing w:after="0" w:afterAutospacing="0" w:before="0" w:beforeAutospacing="0" w:lineRule="auto"/>
         <w:ind w:left="1440" w:hanging="360"/>
@@ -7718,7 +8696,7 @@
       <w:pPr>
         <w:numPr>
           <w:ilvl w:val="0"/>
-          <w:numId w:val="8"/>
+          <w:numId w:val="9"/>
         </w:numPr>
         <w:spacing w:after="0" w:afterAutospacing="0" w:before="0" w:beforeAutospacing="0" w:lineRule="auto"/>
         <w:ind w:left="720" w:hanging="360"/>
@@ -7742,7 +8720,7 @@
       <w:pPr>
         <w:numPr>
           <w:ilvl w:val="1"/>
-          <w:numId w:val="8"/>
+          <w:numId w:val="9"/>
         </w:numPr>
         <w:spacing w:after="0" w:afterAutospacing="0" w:before="0" w:beforeAutospacing="0" w:lineRule="auto"/>
         <w:ind w:left="1440" w:hanging="360"/>
@@ -7764,7 +8742,7 @@
       <w:pPr>
         <w:numPr>
           <w:ilvl w:val="1"/>
-          <w:numId w:val="8"/>
+          <w:numId w:val="9"/>
         </w:numPr>
         <w:spacing w:after="0" w:afterAutospacing="0" w:before="0" w:beforeAutospacing="0" w:lineRule="auto"/>
         <w:ind w:left="1440" w:hanging="360"/>
@@ -7786,7 +8764,7 @@
       <w:pPr>
         <w:numPr>
           <w:ilvl w:val="1"/>
-          <w:numId w:val="8"/>
+          <w:numId w:val="9"/>
         </w:numPr>
         <w:spacing w:after="0" w:afterAutospacing="0" w:before="0" w:beforeAutospacing="0" w:lineRule="auto"/>
         <w:ind w:left="1440" w:hanging="360"/>
@@ -7808,7 +8786,7 @@
       <w:pPr>
         <w:numPr>
           <w:ilvl w:val="1"/>
-          <w:numId w:val="8"/>
+          <w:numId w:val="9"/>
         </w:numPr>
         <w:spacing w:after="0" w:afterAutospacing="0" w:before="0" w:beforeAutospacing="0" w:lineRule="auto"/>
         <w:ind w:left="1440" w:hanging="360"/>
@@ -7830,7 +8808,7 @@
       <w:pPr>
         <w:numPr>
           <w:ilvl w:val="1"/>
-          <w:numId w:val="8"/>
+          <w:numId w:val="9"/>
         </w:numPr>
         <w:spacing w:after="0" w:afterAutospacing="0" w:before="0" w:beforeAutospacing="0" w:lineRule="auto"/>
         <w:ind w:left="1440" w:hanging="360"/>
@@ -7852,7 +8830,7 @@
       <w:pPr>
         <w:numPr>
           <w:ilvl w:val="1"/>
-          <w:numId w:val="8"/>
+          <w:numId w:val="9"/>
         </w:numPr>
         <w:spacing w:after="0" w:afterAutospacing="0" w:before="0" w:beforeAutospacing="0" w:lineRule="auto"/>
         <w:ind w:left="1440" w:hanging="360"/>
@@ -7874,7 +8852,7 @@
       <w:pPr>
         <w:numPr>
           <w:ilvl w:val="2"/>
-          <w:numId w:val="8"/>
+          <w:numId w:val="9"/>
         </w:numPr>
         <w:spacing w:after="0" w:afterAutospacing="0" w:before="0" w:beforeAutospacing="0" w:lineRule="auto"/>
         <w:ind w:left="2160" w:hanging="360"/>
@@ -7896,7 +8874,7 @@
       <w:pPr>
         <w:numPr>
           <w:ilvl w:val="2"/>
-          <w:numId w:val="8"/>
+          <w:numId w:val="9"/>
         </w:numPr>
         <w:spacing w:after="0" w:afterAutospacing="0" w:before="0" w:beforeAutospacing="0" w:lineRule="auto"/>
         <w:ind w:left="2160" w:hanging="360"/>
@@ -7918,7 +8896,7 @@
       <w:pPr>
         <w:numPr>
           <w:ilvl w:val="2"/>
-          <w:numId w:val="8"/>
+          <w:numId w:val="9"/>
         </w:numPr>
         <w:spacing w:after="0" w:afterAutospacing="0" w:before="0" w:beforeAutospacing="0" w:lineRule="auto"/>
         <w:ind w:left="2160" w:hanging="360"/>
@@ -7940,7 +8918,7 @@
       <w:pPr>
         <w:numPr>
           <w:ilvl w:val="0"/>
-          <w:numId w:val="8"/>
+          <w:numId w:val="9"/>
         </w:numPr>
         <w:spacing w:after="0" w:afterAutospacing="0" w:before="0" w:beforeAutospacing="0" w:lineRule="auto"/>
         <w:ind w:left="720" w:hanging="360"/>
@@ -7964,7 +8942,7 @@
       <w:pPr>
         <w:numPr>
           <w:ilvl w:val="1"/>
-          <w:numId w:val="8"/>
+          <w:numId w:val="9"/>
         </w:numPr>
         <w:spacing w:after="0" w:afterAutospacing="0" w:before="0" w:beforeAutospacing="0" w:lineRule="auto"/>
         <w:ind w:left="1440" w:hanging="360"/>
@@ -7986,7 +8964,7 @@
       <w:pPr>
         <w:numPr>
           <w:ilvl w:val="1"/>
-          <w:numId w:val="8"/>
+          <w:numId w:val="9"/>
         </w:numPr>
         <w:spacing w:after="0" w:afterAutospacing="0" w:before="0" w:beforeAutospacing="0" w:lineRule="auto"/>
         <w:ind w:left="1440" w:hanging="360"/>
@@ -8008,7 +8986,7 @@
       <w:pPr>
         <w:numPr>
           <w:ilvl w:val="1"/>
-          <w:numId w:val="8"/>
+          <w:numId w:val="9"/>
         </w:numPr>
         <w:spacing w:after="0" w:afterAutospacing="0" w:before="0" w:beforeAutospacing="0" w:lineRule="auto"/>
         <w:ind w:left="1440" w:hanging="360"/>
@@ -8030,7 +9008,7 @@
       <w:pPr>
         <w:numPr>
           <w:ilvl w:val="1"/>
-          <w:numId w:val="8"/>
+          <w:numId w:val="9"/>
         </w:numPr>
         <w:spacing w:after="0" w:afterAutospacing="0" w:before="0" w:beforeAutospacing="0" w:lineRule="auto"/>
         <w:ind w:left="1440" w:hanging="360"/>
@@ -8052,7 +9030,7 @@
       <w:pPr>
         <w:numPr>
           <w:ilvl w:val="2"/>
-          <w:numId w:val="8"/>
+          <w:numId w:val="9"/>
         </w:numPr>
         <w:spacing w:after="0" w:afterAutospacing="0" w:before="0" w:beforeAutospacing="0" w:lineRule="auto"/>
         <w:ind w:left="2160" w:hanging="360"/>
@@ -8074,7 +9052,7 @@
       <w:pPr>
         <w:numPr>
           <w:ilvl w:val="2"/>
-          <w:numId w:val="8"/>
+          <w:numId w:val="9"/>
         </w:numPr>
         <w:spacing w:after="0" w:afterAutospacing="0" w:before="0" w:beforeAutospacing="0" w:lineRule="auto"/>
         <w:ind w:left="2160" w:hanging="360"/>
@@ -8096,7 +9074,7 @@
       <w:pPr>
         <w:numPr>
           <w:ilvl w:val="1"/>
-          <w:numId w:val="8"/>
+          <w:numId w:val="9"/>
         </w:numPr>
         <w:spacing w:after="0" w:afterAutospacing="0" w:before="0" w:beforeAutospacing="0" w:lineRule="auto"/>
         <w:ind w:left="1440" w:hanging="360"/>
@@ -8118,7 +9096,7 @@
       <w:pPr>
         <w:numPr>
           <w:ilvl w:val="2"/>
-          <w:numId w:val="8"/>
+          <w:numId w:val="9"/>
         </w:numPr>
         <w:spacing w:after="0" w:afterAutospacing="0" w:before="0" w:beforeAutospacing="0" w:lineRule="auto"/>
         <w:ind w:left="2160" w:hanging="360"/>
@@ -8140,7 +9118,7 @@
       <w:pPr>
         <w:numPr>
           <w:ilvl w:val="2"/>
-          <w:numId w:val="8"/>
+          <w:numId w:val="9"/>
         </w:numPr>
         <w:spacing w:after="0" w:afterAutospacing="0" w:before="0" w:beforeAutospacing="0" w:lineRule="auto"/>
         <w:ind w:left="2160" w:hanging="360"/>
@@ -8162,7 +9140,7 @@
       <w:pPr>
         <w:numPr>
           <w:ilvl w:val="2"/>
-          <w:numId w:val="8"/>
+          <w:numId w:val="9"/>
         </w:numPr>
         <w:spacing w:after="0" w:afterAutospacing="0" w:before="0" w:beforeAutospacing="0" w:lineRule="auto"/>
         <w:ind w:left="2160" w:hanging="360"/>
@@ -8184,7 +9162,7 @@
       <w:pPr>
         <w:numPr>
           <w:ilvl w:val="2"/>
-          <w:numId w:val="8"/>
+          <w:numId w:val="9"/>
         </w:numPr>
         <w:spacing w:after="0" w:afterAutospacing="0" w:before="0" w:beforeAutospacing="0" w:lineRule="auto"/>
         <w:ind w:left="2160" w:hanging="360"/>
@@ -8206,7 +9184,7 @@
       <w:pPr>
         <w:numPr>
           <w:ilvl w:val="2"/>
-          <w:numId w:val="8"/>
+          <w:numId w:val="9"/>
         </w:numPr>
         <w:spacing w:after="0" w:afterAutospacing="0" w:before="0" w:beforeAutospacing="0" w:lineRule="auto"/>
         <w:ind w:left="2160" w:hanging="360"/>
@@ -8228,7 +9206,7 @@
       <w:pPr>
         <w:numPr>
           <w:ilvl w:val="1"/>
-          <w:numId w:val="8"/>
+          <w:numId w:val="9"/>
         </w:numPr>
         <w:spacing w:after="0" w:afterAutospacing="0" w:before="0" w:beforeAutospacing="0" w:lineRule="auto"/>
         <w:ind w:left="1440" w:hanging="360"/>
@@ -8250,7 +9228,7 @@
       <w:pPr>
         <w:numPr>
           <w:ilvl w:val="2"/>
-          <w:numId w:val="8"/>
+          <w:numId w:val="9"/>
         </w:numPr>
         <w:spacing w:after="0" w:afterAutospacing="0" w:before="0" w:beforeAutospacing="0" w:lineRule="auto"/>
         <w:ind w:left="2160" w:hanging="360"/>
@@ -8272,7 +9250,7 @@
       <w:pPr>
         <w:numPr>
           <w:ilvl w:val="2"/>
-          <w:numId w:val="8"/>
+          <w:numId w:val="9"/>
         </w:numPr>
         <w:spacing w:after="0" w:afterAutospacing="0" w:before="0" w:beforeAutospacing="0" w:lineRule="auto"/>
         <w:ind w:left="2160" w:hanging="360"/>
@@ -8294,7 +9272,7 @@
       <w:pPr>
         <w:numPr>
           <w:ilvl w:val="0"/>
-          <w:numId w:val="8"/>
+          <w:numId w:val="9"/>
         </w:numPr>
         <w:spacing w:after="0" w:afterAutospacing="0" w:before="0" w:beforeAutospacing="0" w:lineRule="auto"/>
         <w:ind w:left="720" w:hanging="360"/>
@@ -8318,7 +9296,7 @@
       <w:pPr>
         <w:numPr>
           <w:ilvl w:val="1"/>
-          <w:numId w:val="8"/>
+          <w:numId w:val="9"/>
         </w:numPr>
         <w:spacing w:after="0" w:afterAutospacing="0" w:before="0" w:beforeAutospacing="0" w:lineRule="auto"/>
         <w:ind w:left="1440" w:hanging="360"/>
@@ -8340,7 +9318,7 @@
       <w:pPr>
         <w:numPr>
           <w:ilvl w:val="1"/>
-          <w:numId w:val="8"/>
+          <w:numId w:val="9"/>
         </w:numPr>
         <w:spacing w:after="0" w:afterAutospacing="0" w:before="0" w:beforeAutospacing="0" w:lineRule="auto"/>
         <w:ind w:left="1440" w:hanging="360"/>
@@ -8362,7 +9340,7 @@
       <w:pPr>
         <w:numPr>
           <w:ilvl w:val="1"/>
-          <w:numId w:val="8"/>
+          <w:numId w:val="9"/>
         </w:numPr>
         <w:spacing w:after="0" w:afterAutospacing="0" w:before="0" w:beforeAutospacing="0" w:lineRule="auto"/>
         <w:ind w:left="1440" w:hanging="360"/>
@@ -8384,7 +9362,7 @@
       <w:pPr>
         <w:numPr>
           <w:ilvl w:val="2"/>
-          <w:numId w:val="8"/>
+          <w:numId w:val="9"/>
         </w:numPr>
         <w:spacing w:after="0" w:afterAutospacing="0" w:before="0" w:beforeAutospacing="0" w:lineRule="auto"/>
         <w:ind w:left="2160" w:hanging="360"/>
@@ -8406,7 +9384,7 @@
       <w:pPr>
         <w:numPr>
           <w:ilvl w:val="2"/>
-          <w:numId w:val="8"/>
+          <w:numId w:val="9"/>
         </w:numPr>
         <w:spacing w:after="0" w:afterAutospacing="0" w:before="0" w:beforeAutospacing="0" w:lineRule="auto"/>
         <w:ind w:left="2160" w:hanging="360"/>
@@ -8428,7 +9406,7 @@
       <w:pPr>
         <w:numPr>
           <w:ilvl w:val="2"/>
-          <w:numId w:val="8"/>
+          <w:numId w:val="9"/>
         </w:numPr>
         <w:spacing w:after="0" w:afterAutospacing="0" w:before="0" w:beforeAutospacing="0" w:lineRule="auto"/>
         <w:ind w:left="2160" w:hanging="360"/>
@@ -8450,7 +9428,7 @@
       <w:pPr>
         <w:numPr>
           <w:ilvl w:val="2"/>
-          <w:numId w:val="8"/>
+          <w:numId w:val="9"/>
         </w:numPr>
         <w:spacing w:after="0" w:afterAutospacing="0" w:before="0" w:beforeAutospacing="0" w:lineRule="auto"/>
         <w:ind w:left="2160" w:hanging="360"/>
@@ -8477,7 +9455,7 @@
       <w:pPr>
         <w:numPr>
           <w:ilvl w:val="0"/>
-          <w:numId w:val="8"/>
+          <w:numId w:val="9"/>
         </w:numPr>
         <w:spacing w:after="0" w:afterAutospacing="0" w:before="0" w:beforeAutospacing="0" w:lineRule="auto"/>
         <w:ind w:left="720" w:hanging="360"/>
@@ -8501,7 +9479,7 @@
       <w:pPr>
         <w:numPr>
           <w:ilvl w:val="1"/>
-          <w:numId w:val="8"/>
+          <w:numId w:val="9"/>
         </w:numPr>
         <w:spacing w:after="0" w:afterAutospacing="0" w:before="0" w:beforeAutospacing="0" w:lineRule="auto"/>
         <w:ind w:left="1440" w:hanging="360"/>
@@ -8523,7 +9501,7 @@
       <w:pPr>
         <w:numPr>
           <w:ilvl w:val="1"/>
-          <w:numId w:val="8"/>
+          <w:numId w:val="9"/>
         </w:numPr>
         <w:spacing w:after="0" w:afterAutospacing="0" w:before="0" w:beforeAutospacing="0" w:lineRule="auto"/>
         <w:ind w:left="1440" w:hanging="360"/>
@@ -8545,7 +9523,7 @@
       <w:pPr>
         <w:numPr>
           <w:ilvl w:val="1"/>
-          <w:numId w:val="8"/>
+          <w:numId w:val="9"/>
         </w:numPr>
         <w:spacing w:after="0" w:afterAutospacing="0" w:before="0" w:beforeAutospacing="0" w:lineRule="auto"/>
         <w:ind w:left="1440" w:hanging="360"/>
@@ -8567,7 +9545,7 @@
       <w:pPr>
         <w:numPr>
           <w:ilvl w:val="1"/>
-          <w:numId w:val="8"/>
+          <w:numId w:val="9"/>
         </w:numPr>
         <w:spacing w:after="0" w:afterAutospacing="0" w:before="0" w:beforeAutospacing="0" w:lineRule="auto"/>
         <w:ind w:left="1440" w:hanging="360"/>
@@ -8589,7 +9567,7 @@
       <w:pPr>
         <w:numPr>
           <w:ilvl w:val="2"/>
-          <w:numId w:val="8"/>
+          <w:numId w:val="9"/>
         </w:numPr>
         <w:spacing w:after="0" w:afterAutospacing="0" w:before="0" w:beforeAutospacing="0" w:lineRule="auto"/>
         <w:ind w:left="2160" w:hanging="360"/>
@@ -8611,7 +9589,7 @@
       <w:pPr>
         <w:numPr>
           <w:ilvl w:val="2"/>
-          <w:numId w:val="8"/>
+          <w:numId w:val="9"/>
         </w:numPr>
         <w:spacing w:after="0" w:afterAutospacing="0" w:before="0" w:beforeAutospacing="0" w:lineRule="auto"/>
         <w:ind w:left="2160" w:hanging="360"/>
@@ -8633,7 +9611,7 @@
       <w:pPr>
         <w:numPr>
           <w:ilvl w:val="2"/>
-          <w:numId w:val="8"/>
+          <w:numId w:val="9"/>
         </w:numPr>
         <w:spacing w:after="0" w:afterAutospacing="0" w:before="0" w:beforeAutospacing="0" w:lineRule="auto"/>
         <w:ind w:left="2160" w:hanging="360"/>
@@ -8655,7 +9633,7 @@
       <w:pPr>
         <w:numPr>
           <w:ilvl w:val="2"/>
-          <w:numId w:val="8"/>
+          <w:numId w:val="9"/>
         </w:numPr>
         <w:spacing w:after="0" w:afterAutospacing="0" w:before="0" w:beforeAutospacing="0" w:lineRule="auto"/>
         <w:ind w:left="2160" w:hanging="360"/>
@@ -8677,7 +9655,7 @@
       <w:pPr>
         <w:numPr>
           <w:ilvl w:val="1"/>
-          <w:numId w:val="8"/>
+          <w:numId w:val="9"/>
         </w:numPr>
         <w:spacing w:after="0" w:afterAutospacing="0" w:before="0" w:beforeAutospacing="0" w:lineRule="auto"/>
         <w:ind w:left="1440" w:hanging="360"/>
@@ -8699,7 +9677,7 @@
       <w:pPr>
         <w:numPr>
           <w:ilvl w:val="1"/>
-          <w:numId w:val="8"/>
+          <w:numId w:val="9"/>
         </w:numPr>
         <w:spacing w:after="0" w:afterAutospacing="0" w:before="0" w:beforeAutospacing="0" w:lineRule="auto"/>
         <w:ind w:left="1440" w:hanging="360"/>
@@ -8721,7 +9699,7 @@
       <w:pPr>
         <w:numPr>
           <w:ilvl w:val="1"/>
-          <w:numId w:val="8"/>
+          <w:numId w:val="9"/>
         </w:numPr>
         <w:spacing w:after="0" w:afterAutospacing="0" w:before="0" w:beforeAutospacing="0" w:lineRule="auto"/>
         <w:ind w:left="1440" w:hanging="360"/>
@@ -8761,7 +9739,7 @@
       <w:pPr>
         <w:numPr>
           <w:ilvl w:val="0"/>
-          <w:numId w:val="8"/>
+          <w:numId w:val="9"/>
         </w:numPr>
         <w:spacing w:after="0" w:afterAutospacing="0" w:before="0" w:beforeAutospacing="0" w:lineRule="auto"/>
         <w:ind w:left="720" w:hanging="360"/>
@@ -8785,7 +9763,7 @@
       <w:pPr>
         <w:numPr>
           <w:ilvl w:val="1"/>
-          <w:numId w:val="8"/>
+          <w:numId w:val="9"/>
         </w:numPr>
         <w:spacing w:after="0" w:afterAutospacing="0" w:before="0" w:beforeAutospacing="0" w:lineRule="auto"/>
         <w:ind w:left="1440" w:hanging="360"/>
@@ -8807,7 +9785,7 @@
       <w:pPr>
         <w:numPr>
           <w:ilvl w:val="2"/>
-          <w:numId w:val="8"/>
+          <w:numId w:val="9"/>
         </w:numPr>
         <w:spacing w:after="0" w:afterAutospacing="0" w:before="0" w:beforeAutospacing="0" w:lineRule="auto"/>
         <w:ind w:left="2160" w:hanging="360"/>
@@ -8829,7 +9807,7 @@
       <w:pPr>
         <w:numPr>
           <w:ilvl w:val="2"/>
-          <w:numId w:val="8"/>
+          <w:numId w:val="9"/>
         </w:numPr>
         <w:spacing w:after="0" w:afterAutospacing="0" w:before="0" w:beforeAutospacing="0" w:lineRule="auto"/>
         <w:ind w:left="2160" w:hanging="360"/>
@@ -8852,7 +9830,7 @@
       <w:pPr>
         <w:numPr>
           <w:ilvl w:val="2"/>
-          <w:numId w:val="8"/>
+          <w:numId w:val="9"/>
         </w:numPr>
         <w:spacing w:after="0" w:afterAutospacing="0" w:before="0" w:beforeAutospacing="0" w:lineRule="auto"/>
         <w:ind w:left="2160" w:hanging="360"/>
@@ -8874,7 +9852,7 @@
       <w:pPr>
         <w:numPr>
           <w:ilvl w:val="2"/>
-          <w:numId w:val="8"/>
+          <w:numId w:val="9"/>
         </w:numPr>
         <w:spacing w:after="0" w:afterAutospacing="0" w:before="0" w:beforeAutospacing="0" w:lineRule="auto"/>
         <w:ind w:left="2160" w:hanging="360"/>
@@ -8896,7 +9874,7 @@
       <w:pPr>
         <w:numPr>
           <w:ilvl w:val="2"/>
-          <w:numId w:val="8"/>
+          <w:numId w:val="9"/>
         </w:numPr>
         <w:spacing w:after="0" w:afterAutospacing="0" w:before="0" w:beforeAutospacing="0" w:lineRule="auto"/>
         <w:ind w:left="2160" w:hanging="360"/>
@@ -8918,7 +9896,7 @@
       <w:pPr>
         <w:numPr>
           <w:ilvl w:val="1"/>
-          <w:numId w:val="8"/>
+          <w:numId w:val="9"/>
         </w:numPr>
         <w:spacing w:after="0" w:afterAutospacing="0" w:before="0" w:beforeAutospacing="0" w:lineRule="auto"/>
         <w:ind w:left="1440" w:hanging="360"/>
@@ -8940,7 +9918,7 @@
       <w:pPr>
         <w:numPr>
           <w:ilvl w:val="2"/>
-          <w:numId w:val="8"/>
+          <w:numId w:val="9"/>
         </w:numPr>
         <w:spacing w:after="0" w:afterAutospacing="0" w:before="0" w:beforeAutospacing="0" w:lineRule="auto"/>
         <w:ind w:left="2160" w:hanging="360"/>
@@ -8962,7 +9940,7 @@
       <w:pPr>
         <w:numPr>
           <w:ilvl w:val="2"/>
-          <w:numId w:val="8"/>
+          <w:numId w:val="9"/>
         </w:numPr>
         <w:spacing w:after="0" w:afterAutospacing="0" w:before="0" w:beforeAutospacing="0" w:lineRule="auto"/>
         <w:ind w:left="2160" w:hanging="360"/>
@@ -8984,7 +9962,7 @@
       <w:pPr>
         <w:numPr>
           <w:ilvl w:val="1"/>
-          <w:numId w:val="8"/>
+          <w:numId w:val="9"/>
         </w:numPr>
         <w:spacing w:after="0" w:afterAutospacing="0" w:before="0" w:beforeAutospacing="0" w:lineRule="auto"/>
         <w:ind w:left="1440" w:hanging="360"/>
@@ -9006,7 +9984,7 @@
       <w:pPr>
         <w:numPr>
           <w:ilvl w:val="1"/>
-          <w:numId w:val="8"/>
+          <w:numId w:val="9"/>
         </w:numPr>
         <w:spacing w:after="0" w:afterAutospacing="0" w:before="0" w:beforeAutospacing="0" w:lineRule="auto"/>
         <w:ind w:left="1440" w:hanging="360"/>
@@ -9028,7 +10006,7 @@
       <w:pPr>
         <w:numPr>
           <w:ilvl w:val="1"/>
-          <w:numId w:val="8"/>
+          <w:numId w:val="9"/>
         </w:numPr>
         <w:spacing w:after="0" w:afterAutospacing="0" w:before="0" w:beforeAutospacing="0" w:lineRule="auto"/>
         <w:ind w:left="1440" w:hanging="360"/>
@@ -9050,7 +10028,7 @@
       <w:pPr>
         <w:numPr>
           <w:ilvl w:val="0"/>
-          <w:numId w:val="8"/>
+          <w:numId w:val="9"/>
         </w:numPr>
         <w:spacing w:after="0" w:afterAutospacing="0" w:before="0" w:beforeAutospacing="0" w:lineRule="auto"/>
         <w:ind w:left="720" w:hanging="360"/>
@@ -9074,7 +10052,7 @@
       <w:pPr>
         <w:numPr>
           <w:ilvl w:val="1"/>
-          <w:numId w:val="8"/>
+          <w:numId w:val="9"/>
         </w:numPr>
         <w:spacing w:after="0" w:afterAutospacing="0" w:before="0" w:beforeAutospacing="0" w:lineRule="auto"/>
         <w:ind w:left="1440" w:hanging="360"/>
@@ -9106,7 +10084,7 @@
       <w:pPr>
         <w:numPr>
           <w:ilvl w:val="1"/>
-          <w:numId w:val="8"/>
+          <w:numId w:val="9"/>
         </w:numPr>
         <w:spacing w:after="0" w:afterAutospacing="0" w:before="0" w:beforeAutospacing="0" w:lineRule="auto"/>
         <w:ind w:left="1440" w:hanging="360"/>
@@ -9138,7 +10116,7 @@
       <w:pPr>
         <w:numPr>
           <w:ilvl w:val="1"/>
-          <w:numId w:val="8"/>
+          <w:numId w:val="9"/>
         </w:numPr>
         <w:spacing w:after="0" w:afterAutospacing="0" w:before="0" w:beforeAutospacing="0" w:lineRule="auto"/>
         <w:ind w:left="1440" w:hanging="360"/>
@@ -9170,7 +10148,7 @@
       <w:pPr>
         <w:numPr>
           <w:ilvl w:val="1"/>
-          <w:numId w:val="8"/>
+          <w:numId w:val="9"/>
         </w:numPr>
         <w:spacing w:after="0" w:afterAutospacing="0" w:before="0" w:beforeAutospacing="0" w:lineRule="auto"/>
         <w:ind w:left="1440" w:hanging="360"/>
@@ -9202,7 +10180,7 @@
       <w:pPr>
         <w:numPr>
           <w:ilvl w:val="1"/>
-          <w:numId w:val="8"/>
+          <w:numId w:val="9"/>
         </w:numPr>
         <w:spacing w:after="0" w:afterAutospacing="0" w:before="0" w:beforeAutospacing="0" w:lineRule="auto"/>
         <w:ind w:left="1440" w:hanging="360"/>
@@ -9234,7 +10212,7 @@
       <w:pPr>
         <w:numPr>
           <w:ilvl w:val="1"/>
-          <w:numId w:val="8"/>
+          <w:numId w:val="9"/>
         </w:numPr>
         <w:spacing w:after="0" w:afterAutospacing="0" w:before="0" w:beforeAutospacing="0" w:lineRule="auto"/>
         <w:ind w:left="1440" w:hanging="360"/>
@@ -9256,7 +10234,7 @@
       <w:pPr>
         <w:numPr>
           <w:ilvl w:val="0"/>
-          <w:numId w:val="8"/>
+          <w:numId w:val="9"/>
         </w:numPr>
         <w:spacing w:after="0" w:afterAutospacing="0" w:before="0" w:beforeAutospacing="0" w:lineRule="auto"/>
         <w:ind w:left="720" w:hanging="360"/>
@@ -9280,7 +10258,7 @@
       <w:pPr>
         <w:numPr>
           <w:ilvl w:val="1"/>
-          <w:numId w:val="8"/>
+          <w:numId w:val="9"/>
         </w:numPr>
         <w:spacing w:after="0" w:afterAutospacing="0" w:before="0" w:beforeAutospacing="0" w:lineRule="auto"/>
         <w:ind w:left="1440" w:hanging="360"/>
@@ -9302,7 +10280,7 @@
       <w:pPr>
         <w:numPr>
           <w:ilvl w:val="1"/>
-          <w:numId w:val="8"/>
+          <w:numId w:val="9"/>
         </w:numPr>
         <w:spacing w:after="0" w:afterAutospacing="0" w:before="0" w:beforeAutospacing="0" w:lineRule="auto"/>
         <w:ind w:left="1440" w:hanging="360"/>
@@ -9324,7 +10302,7 @@
       <w:pPr>
         <w:numPr>
           <w:ilvl w:val="1"/>
-          <w:numId w:val="8"/>
+          <w:numId w:val="9"/>
         </w:numPr>
         <w:spacing w:after="0" w:afterAutospacing="0" w:before="0" w:beforeAutospacing="0" w:lineRule="auto"/>
         <w:ind w:left="1440" w:hanging="360"/>
@@ -9346,7 +10324,7 @@
       <w:pPr>
         <w:numPr>
           <w:ilvl w:val="0"/>
-          <w:numId w:val="8"/>
+          <w:numId w:val="9"/>
         </w:numPr>
         <w:spacing w:after="0" w:afterAutospacing="0" w:before="0" w:beforeAutospacing="0" w:lineRule="auto"/>
         <w:ind w:left="720" w:hanging="360"/>
@@ -9370,7 +10348,7 @@
       <w:pPr>
         <w:numPr>
           <w:ilvl w:val="1"/>
-          <w:numId w:val="8"/>
+          <w:numId w:val="9"/>
         </w:numPr>
         <w:spacing w:after="0" w:afterAutospacing="0" w:before="0" w:beforeAutospacing="0" w:lineRule="auto"/>
         <w:ind w:left="1440" w:hanging="360"/>
@@ -9392,7 +10370,7 @@
       <w:pPr>
         <w:numPr>
           <w:ilvl w:val="1"/>
-          <w:numId w:val="8"/>
+          <w:numId w:val="9"/>
         </w:numPr>
         <w:spacing w:after="0" w:afterAutospacing="0" w:before="0" w:beforeAutospacing="0" w:lineRule="auto"/>
         <w:ind w:left="1440" w:hanging="360"/>
@@ -9414,7 +10392,7 @@
       <w:pPr>
         <w:numPr>
           <w:ilvl w:val="2"/>
-          <w:numId w:val="8"/>
+          <w:numId w:val="9"/>
         </w:numPr>
         <w:spacing w:after="0" w:afterAutospacing="0" w:before="0" w:beforeAutospacing="0" w:lineRule="auto"/>
         <w:ind w:left="2160" w:hanging="360"/>
@@ -9436,7 +10414,7 @@
       <w:pPr>
         <w:numPr>
           <w:ilvl w:val="2"/>
-          <w:numId w:val="8"/>
+          <w:numId w:val="9"/>
         </w:numPr>
         <w:spacing w:after="0" w:afterAutospacing="0" w:before="0" w:beforeAutospacing="0" w:lineRule="auto"/>
         <w:ind w:left="2160" w:hanging="360"/>
@@ -9458,7 +10436,7 @@
       <w:pPr>
         <w:numPr>
           <w:ilvl w:val="2"/>
-          <w:numId w:val="8"/>
+          <w:numId w:val="9"/>
         </w:numPr>
         <w:spacing w:after="0" w:afterAutospacing="0" w:before="0" w:beforeAutospacing="0" w:lineRule="auto"/>
         <w:ind w:left="2160" w:hanging="360"/>
@@ -9480,7 +10458,7 @@
       <w:pPr>
         <w:numPr>
           <w:ilvl w:val="2"/>
-          <w:numId w:val="8"/>
+          <w:numId w:val="9"/>
         </w:numPr>
         <w:spacing w:after="0" w:afterAutospacing="0" w:before="0" w:beforeAutospacing="0" w:lineRule="auto"/>
         <w:ind w:left="2160" w:hanging="360"/>
@@ -9502,7 +10480,7 @@
       <w:pPr>
         <w:numPr>
           <w:ilvl w:val="1"/>
-          <w:numId w:val="8"/>
+          <w:numId w:val="9"/>
         </w:numPr>
         <w:spacing w:after="0" w:afterAutospacing="0" w:before="0" w:beforeAutospacing="0" w:lineRule="auto"/>
         <w:ind w:left="1440" w:hanging="360"/>
@@ -9524,7 +10502,7 @@
       <w:pPr>
         <w:numPr>
           <w:ilvl w:val="0"/>
-          <w:numId w:val="8"/>
+          <w:numId w:val="9"/>
         </w:numPr>
         <w:spacing w:after="0" w:afterAutospacing="0" w:before="0" w:beforeAutospacing="0" w:lineRule="auto"/>
         <w:ind w:left="720" w:hanging="360"/>
@@ -9548,7 +10526,7 @@
       <w:pPr>
         <w:numPr>
           <w:ilvl w:val="1"/>
-          <w:numId w:val="8"/>
+          <w:numId w:val="9"/>
         </w:numPr>
         <w:spacing w:after="0" w:afterAutospacing="0" w:before="0" w:beforeAutospacing="0" w:lineRule="auto"/>
         <w:ind w:left="1440" w:hanging="360"/>
@@ -9580,7 +10558,7 @@
       <w:pPr>
         <w:numPr>
           <w:ilvl w:val="1"/>
-          <w:numId w:val="8"/>
+          <w:numId w:val="9"/>
         </w:numPr>
         <w:spacing w:after="0" w:afterAutospacing="0" w:before="0" w:beforeAutospacing="0" w:lineRule="auto"/>
         <w:ind w:left="1440" w:hanging="360"/>
@@ -9612,7 +10590,7 @@
       <w:pPr>
         <w:numPr>
           <w:ilvl w:val="1"/>
-          <w:numId w:val="8"/>
+          <w:numId w:val="9"/>
         </w:numPr>
         <w:spacing w:after="0" w:afterAutospacing="0" w:before="0" w:beforeAutospacing="0" w:lineRule="auto"/>
         <w:ind w:left="1440" w:hanging="360"/>
@@ -9644,7 +10622,7 @@
       <w:pPr>
         <w:numPr>
           <w:ilvl w:val="1"/>
-          <w:numId w:val="8"/>
+          <w:numId w:val="9"/>
         </w:numPr>
         <w:spacing w:after="0" w:afterAutospacing="0" w:before="0" w:beforeAutospacing="0" w:lineRule="auto"/>
         <w:ind w:left="1440" w:hanging="360"/>
@@ -9676,7 +10654,7 @@
       <w:pPr>
         <w:numPr>
           <w:ilvl w:val="1"/>
-          <w:numId w:val="8"/>
+          <w:numId w:val="9"/>
         </w:numPr>
         <w:spacing w:after="0" w:afterAutospacing="0" w:before="0" w:beforeAutospacing="0" w:lineRule="auto"/>
         <w:ind w:left="1440" w:hanging="360"/>
@@ -9714,7 +10692,7 @@
       <w:pPr>
         <w:numPr>
           <w:ilvl w:val="1"/>
-          <w:numId w:val="8"/>
+          <w:numId w:val="9"/>
         </w:numPr>
         <w:spacing w:after="0" w:afterAutospacing="0" w:before="0" w:beforeAutospacing="0" w:lineRule="auto"/>
         <w:ind w:left="1440" w:hanging="360"/>
@@ -9736,7 +10714,7 @@
       <w:pPr>
         <w:numPr>
           <w:ilvl w:val="1"/>
-          <w:numId w:val="8"/>
+          <w:numId w:val="9"/>
         </w:numPr>
         <w:spacing w:after="0" w:afterAutospacing="0" w:before="0" w:beforeAutospacing="0" w:lineRule="auto"/>
         <w:ind w:left="1440" w:hanging="360"/>
@@ -9758,7 +10736,7 @@
       <w:pPr>
         <w:numPr>
           <w:ilvl w:val="1"/>
-          <w:numId w:val="8"/>
+          <w:numId w:val="9"/>
         </w:numPr>
         <w:spacing w:after="240" w:before="0" w:beforeAutospacing="0" w:lineRule="auto"/>
         <w:ind w:left="1440" w:hanging="360"/>
@@ -9835,7 +10813,7 @@
       <w:pPr>
         <w:numPr>
           <w:ilvl w:val="0"/>
-          <w:numId w:val="15"/>
+          <w:numId w:val="19"/>
         </w:numPr>
         <w:spacing w:after="0" w:afterAutospacing="0" w:before="240" w:line="240" w:lineRule="auto"/>
         <w:ind w:left="720" w:hanging="360"/>
@@ -9857,7 +10835,7 @@
       <w:pPr>
         <w:numPr>
           <w:ilvl w:val="1"/>
-          <w:numId w:val="15"/>
+          <w:numId w:val="19"/>
         </w:numPr>
         <w:spacing w:after="0" w:afterAutospacing="0" w:before="0" w:beforeAutospacing="0" w:line="240" w:lineRule="auto"/>
         <w:ind w:left="1440" w:hanging="360"/>
@@ -9879,7 +10857,7 @@
       <w:pPr>
         <w:numPr>
           <w:ilvl w:val="0"/>
-          <w:numId w:val="15"/>
+          <w:numId w:val="19"/>
         </w:numPr>
         <w:spacing w:after="0" w:afterAutospacing="0" w:before="0" w:beforeAutospacing="0" w:line="240" w:lineRule="auto"/>
         <w:ind w:left="720" w:hanging="360"/>
@@ -9901,7 +10879,7 @@
       <w:pPr>
         <w:numPr>
           <w:ilvl w:val="0"/>
-          <w:numId w:val="15"/>
+          <w:numId w:val="19"/>
         </w:numPr>
         <w:spacing w:after="0" w:afterAutospacing="0" w:before="0" w:beforeAutospacing="0" w:line="240" w:lineRule="auto"/>
         <w:ind w:left="720" w:hanging="360"/>
@@ -9923,7 +10901,7 @@
       <w:pPr>
         <w:numPr>
           <w:ilvl w:val="0"/>
-          <w:numId w:val="15"/>
+          <w:numId w:val="19"/>
         </w:numPr>
         <w:spacing w:after="0" w:afterAutospacing="0" w:before="0" w:beforeAutospacing="0" w:line="240" w:lineRule="auto"/>
         <w:ind w:left="720" w:hanging="360"/>
@@ -9945,7 +10923,7 @@
       <w:pPr>
         <w:numPr>
           <w:ilvl w:val="0"/>
-          <w:numId w:val="15"/>
+          <w:numId w:val="19"/>
         </w:numPr>
         <w:spacing w:after="0" w:afterAutospacing="0" w:before="0" w:beforeAutospacing="0" w:line="240" w:lineRule="auto"/>
         <w:ind w:left="720" w:hanging="360"/>
@@ -9967,7 +10945,7 @@
       <w:pPr>
         <w:numPr>
           <w:ilvl w:val="0"/>
-          <w:numId w:val="15"/>
+          <w:numId w:val="19"/>
         </w:numPr>
         <w:spacing w:after="0" w:afterAutospacing="0" w:before="0" w:beforeAutospacing="0" w:line="240" w:lineRule="auto"/>
         <w:ind w:left="720" w:hanging="360"/>
@@ -9989,7 +10967,7 @@
       <w:pPr>
         <w:numPr>
           <w:ilvl w:val="0"/>
-          <w:numId w:val="15"/>
+          <w:numId w:val="19"/>
         </w:numPr>
         <w:spacing w:after="0" w:afterAutospacing="0" w:before="0" w:beforeAutospacing="0" w:line="240" w:lineRule="auto"/>
         <w:ind w:left="720" w:hanging="360"/>
@@ -10011,7 +10989,7 @@
       <w:pPr>
         <w:numPr>
           <w:ilvl w:val="0"/>
-          <w:numId w:val="15"/>
+          <w:numId w:val="19"/>
         </w:numPr>
         <w:spacing w:after="240" w:before="0" w:beforeAutospacing="0" w:line="240" w:lineRule="auto"/>
         <w:ind w:left="720" w:hanging="360"/>
@@ -10122,7 +11100,7 @@
       <w:pPr>
         <w:numPr>
           <w:ilvl w:val="0"/>
-          <w:numId w:val="20"/>
+          <w:numId w:val="24"/>
         </w:numPr>
         <w:ind w:left="720" w:hanging="360"/>
         <w:rPr>
@@ -10143,7 +11121,7 @@
       <w:pPr>
         <w:numPr>
           <w:ilvl w:val="0"/>
-          <w:numId w:val="20"/>
+          <w:numId w:val="24"/>
         </w:numPr>
         <w:ind w:left="720" w:hanging="360"/>
         <w:rPr>
@@ -10164,7 +11142,7 @@
       <w:pPr>
         <w:numPr>
           <w:ilvl w:val="0"/>
-          <w:numId w:val="20"/>
+          <w:numId w:val="24"/>
         </w:numPr>
         <w:ind w:left="720" w:hanging="360"/>
         <w:rPr>
@@ -10185,7 +11163,7 @@
       <w:pPr>
         <w:numPr>
           <w:ilvl w:val="0"/>
-          <w:numId w:val="20"/>
+          <w:numId w:val="24"/>
         </w:numPr>
         <w:ind w:left="720" w:hanging="360"/>
         <w:rPr>
@@ -10206,7 +11184,7 @@
       <w:pPr>
         <w:numPr>
           <w:ilvl w:val="0"/>
-          <w:numId w:val="20"/>
+          <w:numId w:val="24"/>
         </w:numPr>
         <w:ind w:left="720" w:hanging="360"/>
         <w:rPr>
@@ -10227,7 +11205,7 @@
       <w:pPr>
         <w:numPr>
           <w:ilvl w:val="0"/>
-          <w:numId w:val="20"/>
+          <w:numId w:val="24"/>
         </w:numPr>
         <w:ind w:left="720" w:hanging="360"/>
         <w:rPr>
@@ -11229,7 +12207,7 @@
       <w:lvlText w:val="●"/>
       <w:lvlJc w:val="left"/>
       <w:pPr>
-        <w:ind w:left="1440" w:hanging="360"/>
+        <w:ind w:left="720" w:hanging="360"/>
       </w:pPr>
       <w:rPr>
         <w:u w:val="none"/>
@@ -11241,91 +12219,91 @@
       <w:lvlText w:val="○"/>
       <w:lvlJc w:val="left"/>
       <w:pPr>
+        <w:ind w:left="1440" w:hanging="360"/>
+      </w:pPr>
+      <w:rPr>
+        <w:u w:val="none"/>
+      </w:rPr>
+    </w:lvl>
+    <w:lvl w:ilvl="2">
+      <w:start w:val="1"/>
+      <w:numFmt w:val="bullet"/>
+      <w:lvlText w:val="■"/>
+      <w:lvlJc w:val="left"/>
+      <w:pPr>
         <w:ind w:left="2160" w:hanging="360"/>
       </w:pPr>
       <w:rPr>
         <w:u w:val="none"/>
       </w:rPr>
     </w:lvl>
-    <w:lvl w:ilvl="2">
+    <w:lvl w:ilvl="3">
+      <w:start w:val="1"/>
+      <w:numFmt w:val="bullet"/>
+      <w:lvlText w:val="●"/>
+      <w:lvlJc w:val="left"/>
+      <w:pPr>
+        <w:ind w:left="2880" w:hanging="360"/>
+      </w:pPr>
+      <w:rPr>
+        <w:u w:val="none"/>
+      </w:rPr>
+    </w:lvl>
+    <w:lvl w:ilvl="4">
+      <w:start w:val="1"/>
+      <w:numFmt w:val="bullet"/>
+      <w:lvlText w:val="○"/>
+      <w:lvlJc w:val="left"/>
+      <w:pPr>
+        <w:ind w:left="3600" w:hanging="360"/>
+      </w:pPr>
+      <w:rPr>
+        <w:u w:val="none"/>
+      </w:rPr>
+    </w:lvl>
+    <w:lvl w:ilvl="5">
       <w:start w:val="1"/>
       <w:numFmt w:val="bullet"/>
       <w:lvlText w:val="■"/>
       <w:lvlJc w:val="left"/>
       <w:pPr>
-        <w:ind w:left="2880" w:hanging="360"/>
-      </w:pPr>
-      <w:rPr>
-        <w:u w:val="none"/>
-      </w:rPr>
-    </w:lvl>
-    <w:lvl w:ilvl="3">
+        <w:ind w:left="4320" w:hanging="360"/>
+      </w:pPr>
+      <w:rPr>
+        <w:u w:val="none"/>
+      </w:rPr>
+    </w:lvl>
+    <w:lvl w:ilvl="6">
       <w:start w:val="1"/>
       <w:numFmt w:val="bullet"/>
       <w:lvlText w:val="●"/>
       <w:lvlJc w:val="left"/>
       <w:pPr>
-        <w:ind w:left="3600" w:hanging="360"/>
-      </w:pPr>
-      <w:rPr>
-        <w:u w:val="none"/>
-      </w:rPr>
-    </w:lvl>
-    <w:lvl w:ilvl="4">
+        <w:ind w:left="5040" w:hanging="360"/>
+      </w:pPr>
+      <w:rPr>
+        <w:u w:val="none"/>
+      </w:rPr>
+    </w:lvl>
+    <w:lvl w:ilvl="7">
       <w:start w:val="1"/>
       <w:numFmt w:val="bullet"/>
       <w:lvlText w:val="○"/>
       <w:lvlJc w:val="left"/>
       <w:pPr>
-        <w:ind w:left="4320" w:hanging="360"/>
-      </w:pPr>
-      <w:rPr>
-        <w:u w:val="none"/>
-      </w:rPr>
-    </w:lvl>
-    <w:lvl w:ilvl="5">
+        <w:ind w:left="5760" w:hanging="360"/>
+      </w:pPr>
+      <w:rPr>
+        <w:u w:val="none"/>
+      </w:rPr>
+    </w:lvl>
+    <w:lvl w:ilvl="8">
       <w:start w:val="1"/>
       <w:numFmt w:val="bullet"/>
       <w:lvlText w:val="■"/>
       <w:lvlJc w:val="left"/>
       <w:pPr>
-        <w:ind w:left="5040" w:hanging="360"/>
-      </w:pPr>
-      <w:rPr>
-        <w:u w:val="none"/>
-      </w:rPr>
-    </w:lvl>
-    <w:lvl w:ilvl="6">
-      <w:start w:val="1"/>
-      <w:numFmt w:val="bullet"/>
-      <w:lvlText w:val="●"/>
-      <w:lvlJc w:val="left"/>
-      <w:pPr>
-        <w:ind w:left="5760" w:hanging="360"/>
-      </w:pPr>
-      <w:rPr>
-        <w:u w:val="none"/>
-      </w:rPr>
-    </w:lvl>
-    <w:lvl w:ilvl="7">
-      <w:start w:val="1"/>
-      <w:numFmt w:val="bullet"/>
-      <w:lvlText w:val="○"/>
-      <w:lvlJc w:val="left"/>
-      <w:pPr>
         <w:ind w:left="6480" w:hanging="360"/>
-      </w:pPr>
-      <w:rPr>
-        <w:u w:val="none"/>
-      </w:rPr>
-    </w:lvl>
-    <w:lvl w:ilvl="8">
-      <w:start w:val="1"/>
-      <w:numFmt w:val="bullet"/>
-      <w:lvlText w:val="■"/>
-      <w:lvlJc w:val="left"/>
-      <w:pPr>
-        <w:ind w:left="7200" w:hanging="360"/>
       </w:pPr>
       <w:rPr>
         <w:u w:val="none"/>
@@ -11339,7 +12317,7 @@
       <w:lvlText w:val="●"/>
       <w:lvlJc w:val="left"/>
       <w:pPr>
-        <w:ind w:left="1440" w:hanging="360"/>
+        <w:ind w:left="720" w:hanging="360"/>
       </w:pPr>
       <w:rPr>
         <w:u w:val="none"/>
@@ -11351,91 +12329,91 @@
       <w:lvlText w:val="○"/>
       <w:lvlJc w:val="left"/>
       <w:pPr>
+        <w:ind w:left="1440" w:hanging="360"/>
+      </w:pPr>
+      <w:rPr>
+        <w:u w:val="none"/>
+      </w:rPr>
+    </w:lvl>
+    <w:lvl w:ilvl="2">
+      <w:start w:val="1"/>
+      <w:numFmt w:val="bullet"/>
+      <w:lvlText w:val="■"/>
+      <w:lvlJc w:val="left"/>
+      <w:pPr>
         <w:ind w:left="2160" w:hanging="360"/>
       </w:pPr>
       <w:rPr>
         <w:u w:val="none"/>
       </w:rPr>
     </w:lvl>
-    <w:lvl w:ilvl="2">
+    <w:lvl w:ilvl="3">
+      <w:start w:val="1"/>
+      <w:numFmt w:val="bullet"/>
+      <w:lvlText w:val="●"/>
+      <w:lvlJc w:val="left"/>
+      <w:pPr>
+        <w:ind w:left="2880" w:hanging="360"/>
+      </w:pPr>
+      <w:rPr>
+        <w:u w:val="none"/>
+      </w:rPr>
+    </w:lvl>
+    <w:lvl w:ilvl="4">
+      <w:start w:val="1"/>
+      <w:numFmt w:val="bullet"/>
+      <w:lvlText w:val="○"/>
+      <w:lvlJc w:val="left"/>
+      <w:pPr>
+        <w:ind w:left="3600" w:hanging="360"/>
+      </w:pPr>
+      <w:rPr>
+        <w:u w:val="none"/>
+      </w:rPr>
+    </w:lvl>
+    <w:lvl w:ilvl="5">
       <w:start w:val="1"/>
       <w:numFmt w:val="bullet"/>
       <w:lvlText w:val="■"/>
       <w:lvlJc w:val="left"/>
       <w:pPr>
-        <w:ind w:left="2880" w:hanging="360"/>
-      </w:pPr>
-      <w:rPr>
-        <w:u w:val="none"/>
-      </w:rPr>
-    </w:lvl>
-    <w:lvl w:ilvl="3">
+        <w:ind w:left="4320" w:hanging="360"/>
+      </w:pPr>
+      <w:rPr>
+        <w:u w:val="none"/>
+      </w:rPr>
+    </w:lvl>
+    <w:lvl w:ilvl="6">
       <w:start w:val="1"/>
       <w:numFmt w:val="bullet"/>
       <w:lvlText w:val="●"/>
       <w:lvlJc w:val="left"/>
       <w:pPr>
-        <w:ind w:left="3600" w:hanging="360"/>
-      </w:pPr>
-      <w:rPr>
-        <w:u w:val="none"/>
-      </w:rPr>
-    </w:lvl>
-    <w:lvl w:ilvl="4">
+        <w:ind w:left="5040" w:hanging="360"/>
+      </w:pPr>
+      <w:rPr>
+        <w:u w:val="none"/>
+      </w:rPr>
+    </w:lvl>
+    <w:lvl w:ilvl="7">
       <w:start w:val="1"/>
       <w:numFmt w:val="bullet"/>
       <w:lvlText w:val="○"/>
       <w:lvlJc w:val="left"/>
       <w:pPr>
-        <w:ind w:left="4320" w:hanging="360"/>
-      </w:pPr>
-      <w:rPr>
-        <w:u w:val="none"/>
-      </w:rPr>
-    </w:lvl>
-    <w:lvl w:ilvl="5">
+        <w:ind w:left="5760" w:hanging="360"/>
+      </w:pPr>
+      <w:rPr>
+        <w:u w:val="none"/>
+      </w:rPr>
+    </w:lvl>
+    <w:lvl w:ilvl="8">
       <w:start w:val="1"/>
       <w:numFmt w:val="bullet"/>
       <w:lvlText w:val="■"/>
       <w:lvlJc w:val="left"/>
       <w:pPr>
-        <w:ind w:left="5040" w:hanging="360"/>
-      </w:pPr>
-      <w:rPr>
-        <w:u w:val="none"/>
-      </w:rPr>
-    </w:lvl>
-    <w:lvl w:ilvl="6">
-      <w:start w:val="1"/>
-      <w:numFmt w:val="bullet"/>
-      <w:lvlText w:val="●"/>
-      <w:lvlJc w:val="left"/>
-      <w:pPr>
-        <w:ind w:left="5760" w:hanging="360"/>
-      </w:pPr>
-      <w:rPr>
-        <w:u w:val="none"/>
-      </w:rPr>
-    </w:lvl>
-    <w:lvl w:ilvl="7">
-      <w:start w:val="1"/>
-      <w:numFmt w:val="bullet"/>
-      <w:lvlText w:val="○"/>
-      <w:lvlJc w:val="left"/>
-      <w:pPr>
         <w:ind w:left="6480" w:hanging="360"/>
-      </w:pPr>
-      <w:rPr>
-        <w:u w:val="none"/>
-      </w:rPr>
-    </w:lvl>
-    <w:lvl w:ilvl="8">
-      <w:start w:val="1"/>
-      <w:numFmt w:val="bullet"/>
-      <w:lvlText w:val="■"/>
-      <w:lvlJc w:val="left"/>
-      <w:pPr>
-        <w:ind w:left="7200" w:hanging="360"/>
       </w:pPr>
       <w:rPr>
         <w:u w:val="none"/>
@@ -11889,7 +12867,7 @@
       <w:lvlText w:val="●"/>
       <w:lvlJc w:val="left"/>
       <w:pPr>
-        <w:ind w:left="720" w:hanging="360"/>
+        <w:ind w:left="1440" w:hanging="360"/>
       </w:pPr>
       <w:rPr>
         <w:u w:val="none"/>
@@ -11901,7 +12879,7 @@
       <w:lvlText w:val="○"/>
       <w:lvlJc w:val="left"/>
       <w:pPr>
-        <w:ind w:left="1440" w:hanging="360"/>
+        <w:ind w:left="2160" w:hanging="360"/>
       </w:pPr>
       <w:rPr>
         <w:u w:val="none"/>
@@ -11913,7 +12891,7 @@
       <w:lvlText w:val="■"/>
       <w:lvlJc w:val="left"/>
       <w:pPr>
-        <w:ind w:left="2160" w:hanging="360"/>
+        <w:ind w:left="2880" w:hanging="360"/>
       </w:pPr>
       <w:rPr>
         <w:u w:val="none"/>
@@ -11925,7 +12903,7 @@
       <w:lvlText w:val="●"/>
       <w:lvlJc w:val="left"/>
       <w:pPr>
-        <w:ind w:left="2880" w:hanging="360"/>
+        <w:ind w:left="3600" w:hanging="360"/>
       </w:pPr>
       <w:rPr>
         <w:u w:val="none"/>
@@ -11937,7 +12915,7 @@
       <w:lvlText w:val="○"/>
       <w:lvlJc w:val="left"/>
       <w:pPr>
-        <w:ind w:left="3600" w:hanging="360"/>
+        <w:ind w:left="4320" w:hanging="360"/>
       </w:pPr>
       <w:rPr>
         <w:u w:val="none"/>
@@ -11949,7 +12927,7 @@
       <w:lvlText w:val="■"/>
       <w:lvlJc w:val="left"/>
       <w:pPr>
-        <w:ind w:left="4320" w:hanging="360"/>
+        <w:ind w:left="5040" w:hanging="360"/>
       </w:pPr>
       <w:rPr>
         <w:u w:val="none"/>
@@ -11961,7 +12939,7 @@
       <w:lvlText w:val="●"/>
       <w:lvlJc w:val="left"/>
       <w:pPr>
-        <w:ind w:left="5040" w:hanging="360"/>
+        <w:ind w:left="5760" w:hanging="360"/>
       </w:pPr>
       <w:rPr>
         <w:u w:val="none"/>
@@ -11973,7 +12951,7 @@
       <w:lvlText w:val="○"/>
       <w:lvlJc w:val="left"/>
       <w:pPr>
-        <w:ind w:left="5760" w:hanging="360"/>
+        <w:ind w:left="6480" w:hanging="360"/>
       </w:pPr>
       <w:rPr>
         <w:u w:val="none"/>
@@ -11985,7 +12963,7 @@
       <w:lvlText w:val="■"/>
       <w:lvlJc w:val="left"/>
       <w:pPr>
-        <w:ind w:left="6480" w:hanging="360"/>
+        <w:ind w:left="7200" w:hanging="360"/>
       </w:pPr>
       <w:rPr>
         <w:u w:val="none"/>
@@ -11999,7 +12977,7 @@
       <w:lvlText w:val="●"/>
       <w:lvlJc w:val="left"/>
       <w:pPr>
-        <w:ind w:left="720" w:hanging="360"/>
+        <w:ind w:left="1440" w:hanging="360"/>
       </w:pPr>
       <w:rPr>
         <w:u w:val="none"/>
@@ -12011,7 +12989,7 @@
       <w:lvlText w:val="○"/>
       <w:lvlJc w:val="left"/>
       <w:pPr>
-        <w:ind w:left="1440" w:hanging="360"/>
+        <w:ind w:left="2160" w:hanging="360"/>
       </w:pPr>
       <w:rPr>
         <w:u w:val="none"/>
@@ -12023,7 +13001,7 @@
       <w:lvlText w:val="■"/>
       <w:lvlJc w:val="left"/>
       <w:pPr>
-        <w:ind w:left="2160" w:hanging="360"/>
+        <w:ind w:left="2880" w:hanging="360"/>
       </w:pPr>
       <w:rPr>
         <w:u w:val="none"/>
@@ -12035,7 +13013,7 @@
       <w:lvlText w:val="●"/>
       <w:lvlJc w:val="left"/>
       <w:pPr>
-        <w:ind w:left="2880" w:hanging="360"/>
+        <w:ind w:left="3600" w:hanging="360"/>
       </w:pPr>
       <w:rPr>
         <w:u w:val="none"/>
@@ -12047,7 +13025,7 @@
       <w:lvlText w:val="○"/>
       <w:lvlJc w:val="left"/>
       <w:pPr>
-        <w:ind w:left="3600" w:hanging="360"/>
+        <w:ind w:left="4320" w:hanging="360"/>
       </w:pPr>
       <w:rPr>
         <w:u w:val="none"/>
@@ -12059,7 +13037,7 @@
       <w:lvlText w:val="■"/>
       <w:lvlJc w:val="left"/>
       <w:pPr>
-        <w:ind w:left="4320" w:hanging="360"/>
+        <w:ind w:left="5040" w:hanging="360"/>
       </w:pPr>
       <w:rPr>
         <w:u w:val="none"/>
@@ -12071,7 +13049,7 @@
       <w:lvlText w:val="●"/>
       <w:lvlJc w:val="left"/>
       <w:pPr>
-        <w:ind w:left="5040" w:hanging="360"/>
+        <w:ind w:left="5760" w:hanging="360"/>
       </w:pPr>
       <w:rPr>
         <w:u w:val="none"/>
@@ -12083,7 +13061,7 @@
       <w:lvlText w:val="○"/>
       <w:lvlJc w:val="left"/>
       <w:pPr>
-        <w:ind w:left="5760" w:hanging="360"/>
+        <w:ind w:left="6480" w:hanging="360"/>
       </w:pPr>
       <w:rPr>
         <w:u w:val="none"/>
@@ -12095,7 +13073,7 @@
       <w:lvlText w:val="■"/>
       <w:lvlJc w:val="left"/>
       <w:pPr>
-        <w:ind w:left="6480" w:hanging="360"/>
+        <w:ind w:left="7200" w:hanging="360"/>
       </w:pPr>
       <w:rPr>
         <w:u w:val="none"/>
@@ -12433,6 +13411,446 @@
     </w:lvl>
   </w:abstractNum>
   <w:abstractNum w:abstractNumId="20">
+    <w:lvl w:ilvl="0">
+      <w:start w:val="1"/>
+      <w:numFmt w:val="bullet"/>
+      <w:lvlText w:val="●"/>
+      <w:lvlJc w:val="left"/>
+      <w:pPr>
+        <w:ind w:left="720" w:hanging="360"/>
+      </w:pPr>
+      <w:rPr>
+        <w:u w:val="none"/>
+      </w:rPr>
+    </w:lvl>
+    <w:lvl w:ilvl="1">
+      <w:start w:val="1"/>
+      <w:numFmt w:val="bullet"/>
+      <w:lvlText w:val="○"/>
+      <w:lvlJc w:val="left"/>
+      <w:pPr>
+        <w:ind w:left="1440" w:hanging="360"/>
+      </w:pPr>
+      <w:rPr>
+        <w:u w:val="none"/>
+      </w:rPr>
+    </w:lvl>
+    <w:lvl w:ilvl="2">
+      <w:start w:val="1"/>
+      <w:numFmt w:val="bullet"/>
+      <w:lvlText w:val="■"/>
+      <w:lvlJc w:val="left"/>
+      <w:pPr>
+        <w:ind w:left="2160" w:hanging="360"/>
+      </w:pPr>
+      <w:rPr>
+        <w:u w:val="none"/>
+      </w:rPr>
+    </w:lvl>
+    <w:lvl w:ilvl="3">
+      <w:start w:val="1"/>
+      <w:numFmt w:val="bullet"/>
+      <w:lvlText w:val="●"/>
+      <w:lvlJc w:val="left"/>
+      <w:pPr>
+        <w:ind w:left="2880" w:hanging="360"/>
+      </w:pPr>
+      <w:rPr>
+        <w:u w:val="none"/>
+      </w:rPr>
+    </w:lvl>
+    <w:lvl w:ilvl="4">
+      <w:start w:val="1"/>
+      <w:numFmt w:val="bullet"/>
+      <w:lvlText w:val="○"/>
+      <w:lvlJc w:val="left"/>
+      <w:pPr>
+        <w:ind w:left="3600" w:hanging="360"/>
+      </w:pPr>
+      <w:rPr>
+        <w:u w:val="none"/>
+      </w:rPr>
+    </w:lvl>
+    <w:lvl w:ilvl="5">
+      <w:start w:val="1"/>
+      <w:numFmt w:val="bullet"/>
+      <w:lvlText w:val="■"/>
+      <w:lvlJc w:val="left"/>
+      <w:pPr>
+        <w:ind w:left="4320" w:hanging="360"/>
+      </w:pPr>
+      <w:rPr>
+        <w:u w:val="none"/>
+      </w:rPr>
+    </w:lvl>
+    <w:lvl w:ilvl="6">
+      <w:start w:val="1"/>
+      <w:numFmt w:val="bullet"/>
+      <w:lvlText w:val="●"/>
+      <w:lvlJc w:val="left"/>
+      <w:pPr>
+        <w:ind w:left="5040" w:hanging="360"/>
+      </w:pPr>
+      <w:rPr>
+        <w:u w:val="none"/>
+      </w:rPr>
+    </w:lvl>
+    <w:lvl w:ilvl="7">
+      <w:start w:val="1"/>
+      <w:numFmt w:val="bullet"/>
+      <w:lvlText w:val="○"/>
+      <w:lvlJc w:val="left"/>
+      <w:pPr>
+        <w:ind w:left="5760" w:hanging="360"/>
+      </w:pPr>
+      <w:rPr>
+        <w:u w:val="none"/>
+      </w:rPr>
+    </w:lvl>
+    <w:lvl w:ilvl="8">
+      <w:start w:val="1"/>
+      <w:numFmt w:val="bullet"/>
+      <w:lvlText w:val="■"/>
+      <w:lvlJc w:val="left"/>
+      <w:pPr>
+        <w:ind w:left="6480" w:hanging="360"/>
+      </w:pPr>
+      <w:rPr>
+        <w:u w:val="none"/>
+      </w:rPr>
+    </w:lvl>
+  </w:abstractNum>
+  <w:abstractNum w:abstractNumId="21">
+    <w:lvl w:ilvl="0">
+      <w:start w:val="1"/>
+      <w:numFmt w:val="bullet"/>
+      <w:lvlText w:val="●"/>
+      <w:lvlJc w:val="left"/>
+      <w:pPr>
+        <w:ind w:left="720" w:hanging="360"/>
+      </w:pPr>
+      <w:rPr>
+        <w:u w:val="none"/>
+      </w:rPr>
+    </w:lvl>
+    <w:lvl w:ilvl="1">
+      <w:start w:val="1"/>
+      <w:numFmt w:val="bullet"/>
+      <w:lvlText w:val="○"/>
+      <w:lvlJc w:val="left"/>
+      <w:pPr>
+        <w:ind w:left="1440" w:hanging="360"/>
+      </w:pPr>
+      <w:rPr>
+        <w:u w:val="none"/>
+      </w:rPr>
+    </w:lvl>
+    <w:lvl w:ilvl="2">
+      <w:start w:val="1"/>
+      <w:numFmt w:val="bullet"/>
+      <w:lvlText w:val="■"/>
+      <w:lvlJc w:val="left"/>
+      <w:pPr>
+        <w:ind w:left="2160" w:hanging="360"/>
+      </w:pPr>
+      <w:rPr>
+        <w:u w:val="none"/>
+      </w:rPr>
+    </w:lvl>
+    <w:lvl w:ilvl="3">
+      <w:start w:val="1"/>
+      <w:numFmt w:val="bullet"/>
+      <w:lvlText w:val="●"/>
+      <w:lvlJc w:val="left"/>
+      <w:pPr>
+        <w:ind w:left="2880" w:hanging="360"/>
+      </w:pPr>
+      <w:rPr>
+        <w:u w:val="none"/>
+      </w:rPr>
+    </w:lvl>
+    <w:lvl w:ilvl="4">
+      <w:start w:val="1"/>
+      <w:numFmt w:val="bullet"/>
+      <w:lvlText w:val="○"/>
+      <w:lvlJc w:val="left"/>
+      <w:pPr>
+        <w:ind w:left="3600" w:hanging="360"/>
+      </w:pPr>
+      <w:rPr>
+        <w:u w:val="none"/>
+      </w:rPr>
+    </w:lvl>
+    <w:lvl w:ilvl="5">
+      <w:start w:val="1"/>
+      <w:numFmt w:val="bullet"/>
+      <w:lvlText w:val="■"/>
+      <w:lvlJc w:val="left"/>
+      <w:pPr>
+        <w:ind w:left="4320" w:hanging="360"/>
+      </w:pPr>
+      <w:rPr>
+        <w:u w:val="none"/>
+      </w:rPr>
+    </w:lvl>
+    <w:lvl w:ilvl="6">
+      <w:start w:val="1"/>
+      <w:numFmt w:val="bullet"/>
+      <w:lvlText w:val="●"/>
+      <w:lvlJc w:val="left"/>
+      <w:pPr>
+        <w:ind w:left="5040" w:hanging="360"/>
+      </w:pPr>
+      <w:rPr>
+        <w:u w:val="none"/>
+      </w:rPr>
+    </w:lvl>
+    <w:lvl w:ilvl="7">
+      <w:start w:val="1"/>
+      <w:numFmt w:val="bullet"/>
+      <w:lvlText w:val="○"/>
+      <w:lvlJc w:val="left"/>
+      <w:pPr>
+        <w:ind w:left="5760" w:hanging="360"/>
+      </w:pPr>
+      <w:rPr>
+        <w:u w:val="none"/>
+      </w:rPr>
+    </w:lvl>
+    <w:lvl w:ilvl="8">
+      <w:start w:val="1"/>
+      <w:numFmt w:val="bullet"/>
+      <w:lvlText w:val="■"/>
+      <w:lvlJc w:val="left"/>
+      <w:pPr>
+        <w:ind w:left="6480" w:hanging="360"/>
+      </w:pPr>
+      <w:rPr>
+        <w:u w:val="none"/>
+      </w:rPr>
+    </w:lvl>
+  </w:abstractNum>
+  <w:abstractNum w:abstractNumId="22">
+    <w:lvl w:ilvl="0">
+      <w:start w:val="1"/>
+      <w:numFmt w:val="bullet"/>
+      <w:lvlText w:val="●"/>
+      <w:lvlJc w:val="left"/>
+      <w:pPr>
+        <w:ind w:left="720" w:hanging="360"/>
+      </w:pPr>
+      <w:rPr>
+        <w:u w:val="none"/>
+      </w:rPr>
+    </w:lvl>
+    <w:lvl w:ilvl="1">
+      <w:start w:val="1"/>
+      <w:numFmt w:val="bullet"/>
+      <w:lvlText w:val="○"/>
+      <w:lvlJc w:val="left"/>
+      <w:pPr>
+        <w:ind w:left="1440" w:hanging="360"/>
+      </w:pPr>
+      <w:rPr>
+        <w:u w:val="none"/>
+      </w:rPr>
+    </w:lvl>
+    <w:lvl w:ilvl="2">
+      <w:start w:val="1"/>
+      <w:numFmt w:val="bullet"/>
+      <w:lvlText w:val="■"/>
+      <w:lvlJc w:val="left"/>
+      <w:pPr>
+        <w:ind w:left="2160" w:hanging="360"/>
+      </w:pPr>
+      <w:rPr>
+        <w:u w:val="none"/>
+      </w:rPr>
+    </w:lvl>
+    <w:lvl w:ilvl="3">
+      <w:start w:val="1"/>
+      <w:numFmt w:val="bullet"/>
+      <w:lvlText w:val="●"/>
+      <w:lvlJc w:val="left"/>
+      <w:pPr>
+        <w:ind w:left="2880" w:hanging="360"/>
+      </w:pPr>
+      <w:rPr>
+        <w:u w:val="none"/>
+      </w:rPr>
+    </w:lvl>
+    <w:lvl w:ilvl="4">
+      <w:start w:val="1"/>
+      <w:numFmt w:val="bullet"/>
+      <w:lvlText w:val="○"/>
+      <w:lvlJc w:val="left"/>
+      <w:pPr>
+        <w:ind w:left="3600" w:hanging="360"/>
+      </w:pPr>
+      <w:rPr>
+        <w:u w:val="none"/>
+      </w:rPr>
+    </w:lvl>
+    <w:lvl w:ilvl="5">
+      <w:start w:val="1"/>
+      <w:numFmt w:val="bullet"/>
+      <w:lvlText w:val="■"/>
+      <w:lvlJc w:val="left"/>
+      <w:pPr>
+        <w:ind w:left="4320" w:hanging="360"/>
+      </w:pPr>
+      <w:rPr>
+        <w:u w:val="none"/>
+      </w:rPr>
+    </w:lvl>
+    <w:lvl w:ilvl="6">
+      <w:start w:val="1"/>
+      <w:numFmt w:val="bullet"/>
+      <w:lvlText w:val="●"/>
+      <w:lvlJc w:val="left"/>
+      <w:pPr>
+        <w:ind w:left="5040" w:hanging="360"/>
+      </w:pPr>
+      <w:rPr>
+        <w:u w:val="none"/>
+      </w:rPr>
+    </w:lvl>
+    <w:lvl w:ilvl="7">
+      <w:start w:val="1"/>
+      <w:numFmt w:val="bullet"/>
+      <w:lvlText w:val="○"/>
+      <w:lvlJc w:val="left"/>
+      <w:pPr>
+        <w:ind w:left="5760" w:hanging="360"/>
+      </w:pPr>
+      <w:rPr>
+        <w:u w:val="none"/>
+      </w:rPr>
+    </w:lvl>
+    <w:lvl w:ilvl="8">
+      <w:start w:val="1"/>
+      <w:numFmt w:val="bullet"/>
+      <w:lvlText w:val="■"/>
+      <w:lvlJc w:val="left"/>
+      <w:pPr>
+        <w:ind w:left="6480" w:hanging="360"/>
+      </w:pPr>
+      <w:rPr>
+        <w:u w:val="none"/>
+      </w:rPr>
+    </w:lvl>
+  </w:abstractNum>
+  <w:abstractNum w:abstractNumId="23">
+    <w:lvl w:ilvl="0">
+      <w:start w:val="1"/>
+      <w:numFmt w:val="bullet"/>
+      <w:lvlText w:val="●"/>
+      <w:lvlJc w:val="left"/>
+      <w:pPr>
+        <w:ind w:left="720" w:hanging="360"/>
+      </w:pPr>
+      <w:rPr>
+        <w:u w:val="none"/>
+      </w:rPr>
+    </w:lvl>
+    <w:lvl w:ilvl="1">
+      <w:start w:val="1"/>
+      <w:numFmt w:val="bullet"/>
+      <w:lvlText w:val="○"/>
+      <w:lvlJc w:val="left"/>
+      <w:pPr>
+        <w:ind w:left="1440" w:hanging="360"/>
+      </w:pPr>
+      <w:rPr>
+        <w:u w:val="none"/>
+      </w:rPr>
+    </w:lvl>
+    <w:lvl w:ilvl="2">
+      <w:start w:val="1"/>
+      <w:numFmt w:val="bullet"/>
+      <w:lvlText w:val="■"/>
+      <w:lvlJc w:val="left"/>
+      <w:pPr>
+        <w:ind w:left="2160" w:hanging="360"/>
+      </w:pPr>
+      <w:rPr>
+        <w:u w:val="none"/>
+      </w:rPr>
+    </w:lvl>
+    <w:lvl w:ilvl="3">
+      <w:start w:val="1"/>
+      <w:numFmt w:val="bullet"/>
+      <w:lvlText w:val="●"/>
+      <w:lvlJc w:val="left"/>
+      <w:pPr>
+        <w:ind w:left="2880" w:hanging="360"/>
+      </w:pPr>
+      <w:rPr>
+        <w:u w:val="none"/>
+      </w:rPr>
+    </w:lvl>
+    <w:lvl w:ilvl="4">
+      <w:start w:val="1"/>
+      <w:numFmt w:val="bullet"/>
+      <w:lvlText w:val="○"/>
+      <w:lvlJc w:val="left"/>
+      <w:pPr>
+        <w:ind w:left="3600" w:hanging="360"/>
+      </w:pPr>
+      <w:rPr>
+        <w:u w:val="none"/>
+      </w:rPr>
+    </w:lvl>
+    <w:lvl w:ilvl="5">
+      <w:start w:val="1"/>
+      <w:numFmt w:val="bullet"/>
+      <w:lvlText w:val="■"/>
+      <w:lvlJc w:val="left"/>
+      <w:pPr>
+        <w:ind w:left="4320" w:hanging="360"/>
+      </w:pPr>
+      <w:rPr>
+        <w:u w:val="none"/>
+      </w:rPr>
+    </w:lvl>
+    <w:lvl w:ilvl="6">
+      <w:start w:val="1"/>
+      <w:numFmt w:val="bullet"/>
+      <w:lvlText w:val="●"/>
+      <w:lvlJc w:val="left"/>
+      <w:pPr>
+        <w:ind w:left="5040" w:hanging="360"/>
+      </w:pPr>
+      <w:rPr>
+        <w:u w:val="none"/>
+      </w:rPr>
+    </w:lvl>
+    <w:lvl w:ilvl="7">
+      <w:start w:val="1"/>
+      <w:numFmt w:val="bullet"/>
+      <w:lvlText w:val="○"/>
+      <w:lvlJc w:val="left"/>
+      <w:pPr>
+        <w:ind w:left="5760" w:hanging="360"/>
+      </w:pPr>
+      <w:rPr>
+        <w:u w:val="none"/>
+      </w:rPr>
+    </w:lvl>
+    <w:lvl w:ilvl="8">
+      <w:start w:val="1"/>
+      <w:numFmt w:val="bullet"/>
+      <w:lvlText w:val="■"/>
+      <w:lvlJc w:val="left"/>
+      <w:pPr>
+        <w:ind w:left="6480" w:hanging="360"/>
+      </w:pPr>
+      <w:rPr>
+        <w:u w:val="none"/>
+      </w:rPr>
+    </w:lvl>
+  </w:abstractNum>
+  <w:abstractNum w:abstractNumId="24">
     <w:lvl w:ilvl="0">
       <w:start w:val="1"/>
       <w:numFmt w:val="bullet"/>
@@ -12601,6 +14019,18 @@
   </w:num>
   <w:num w:numId="20">
     <w:abstractNumId w:val="20"/>
+  </w:num>
+  <w:num w:numId="21">
+    <w:abstractNumId w:val="21"/>
+  </w:num>
+  <w:num w:numId="22">
+    <w:abstractNumId w:val="22"/>
+  </w:num>
+  <w:num w:numId="23">
+    <w:abstractNumId w:val="23"/>
+  </w:num>
+  <w:num w:numId="24">
+    <w:abstractNumId w:val="24"/>
   </w:num>
 </w:numbering>
 </file>

</xml_diff>